<commit_message>
Update report content and cover page title
- Changed cover page title from "课程项目报告" to "金融工程策略研究".
- Revised the abstract to emphasize key findings and conclusions regarding the IC and IM strategies.
- Enhanced clarity and structure of the report by updating various sections, including backtesting protocols and strategy designs.
- Improved the presentation of statistical evidence and risk management discussions.
- Adjusted the language for better readability and coherence throughout the document.
</commit_message>
<xml_diff>
--- a/report/股指期货套利策略研究报告.docx
+++ b/report/股指期货套利策略研究报告.docx
@@ -498,13 +498,13 @@
     <w:p>
       <w:pPr>
         <w:rPr>
-          <w:rFonts w:hint="eastAsia"/>
           <w:lang w:eastAsia="zh-CN"/>
         </w:rPr>
       </w:pPr>
-    </w:p>
-    <w:p>
-      <w:r>
+      <w:r>
+        <w:rPr>
+          <w:lang w:eastAsia="zh-CN"/>
+        </w:rPr>
         <w:br w:type="page"/>
       </w:r>
     </w:p>
@@ -560,7 +560,7 @@
         </w:rPr>
         <w:fldChar w:fldCharType="separate"/>
       </w:r>
-      <w:hyperlink w:anchor="_Toc231914635" w:history="1">
+      <w:hyperlink w:anchor="_Toc231916807" w:history="1">
         <w:r>
           <w:rPr>
             <w:rStyle w:val="aff9"/>
@@ -588,7 +588,7 @@
             <w:noProof/>
             <w:webHidden/>
           </w:rPr>
-          <w:instrText xml:space="preserve"> PAGEREF _Toc231914635 \h </w:instrText>
+          <w:instrText xml:space="preserve"> PAGEREF _Toc231916807 \h </w:instrText>
         </w:r>
         <w:r>
           <w:rPr>
@@ -636,7 +636,7 @@
           <w14:ligatures w14:val="standardContextual"/>
         </w:rPr>
       </w:pPr>
-      <w:hyperlink w:anchor="_Toc231914636" w:history="1">
+      <w:hyperlink w:anchor="_Toc231916808" w:history="1">
         <w:r>
           <w:rPr>
             <w:rStyle w:val="aff9"/>
@@ -672,7 +672,7 @@
             <w:noProof/>
             <w:webHidden/>
           </w:rPr>
-          <w:instrText xml:space="preserve"> PAGEREF _Toc231914636 \h </w:instrText>
+          <w:instrText xml:space="preserve"> PAGEREF _Toc231916808 \h </w:instrText>
         </w:r>
         <w:r>
           <w:rPr>
@@ -721,7 +721,7 @@
           <w14:ligatures w14:val="standardContextual"/>
         </w:rPr>
       </w:pPr>
-      <w:hyperlink w:anchor="_Toc231914637" w:history="1">
+      <w:hyperlink w:anchor="_Toc231916809" w:history="1">
         <w:r>
           <w:rPr>
             <w:rStyle w:val="aff9"/>
@@ -757,7 +757,7 @@
             <w:noProof/>
             <w:webHidden/>
           </w:rPr>
-          <w:instrText xml:space="preserve"> PAGEREF _Toc231914637 \h </w:instrText>
+          <w:instrText xml:space="preserve"> PAGEREF _Toc231916809 \h </w:instrText>
         </w:r>
         <w:r>
           <w:rPr>
@@ -806,7 +806,7 @@
           <w14:ligatures w14:val="standardContextual"/>
         </w:rPr>
       </w:pPr>
-      <w:hyperlink w:anchor="_Toc231914638" w:history="1">
+      <w:hyperlink w:anchor="_Toc231916810" w:history="1">
         <w:r>
           <w:rPr>
             <w:rStyle w:val="aff9"/>
@@ -842,7 +842,7 @@
             <w:noProof/>
             <w:webHidden/>
           </w:rPr>
-          <w:instrText xml:space="preserve"> PAGEREF _Toc231914638 \h </w:instrText>
+          <w:instrText xml:space="preserve"> PAGEREF _Toc231916810 \h </w:instrText>
         </w:r>
         <w:r>
           <w:rPr>
@@ -891,7 +891,7 @@
           <w14:ligatures w14:val="standardContextual"/>
         </w:rPr>
       </w:pPr>
-      <w:hyperlink w:anchor="_Toc231914639" w:history="1">
+      <w:hyperlink w:anchor="_Toc231916811" w:history="1">
         <w:r>
           <w:rPr>
             <w:rStyle w:val="aff9"/>
@@ -927,7 +927,7 @@
             <w:noProof/>
             <w:webHidden/>
           </w:rPr>
-          <w:instrText xml:space="preserve"> PAGEREF _Toc231914639 \h </w:instrText>
+          <w:instrText xml:space="preserve"> PAGEREF _Toc231916811 \h </w:instrText>
         </w:r>
         <w:r>
           <w:rPr>
@@ -975,7 +975,7 @@
           <w14:ligatures w14:val="standardContextual"/>
         </w:rPr>
       </w:pPr>
-      <w:hyperlink w:anchor="_Toc231914640" w:history="1">
+      <w:hyperlink w:anchor="_Toc231916812" w:history="1">
         <w:r>
           <w:rPr>
             <w:rStyle w:val="aff9"/>
@@ -1011,7 +1011,7 @@
             <w:noProof/>
             <w:webHidden/>
           </w:rPr>
-          <w:instrText xml:space="preserve"> PAGEREF _Toc231914640 \h </w:instrText>
+          <w:instrText xml:space="preserve"> PAGEREF _Toc231916812 \h </w:instrText>
         </w:r>
         <w:r>
           <w:rPr>
@@ -1060,7 +1060,7 @@
           <w14:ligatures w14:val="standardContextual"/>
         </w:rPr>
       </w:pPr>
-      <w:hyperlink w:anchor="_Toc231914641" w:history="1">
+      <w:hyperlink w:anchor="_Toc231916813" w:history="1">
         <w:r>
           <w:rPr>
             <w:rStyle w:val="aff9"/>
@@ -1096,7 +1096,7 @@
             <w:noProof/>
             <w:webHidden/>
           </w:rPr>
-          <w:instrText xml:space="preserve"> PAGEREF _Toc231914641 \h </w:instrText>
+          <w:instrText xml:space="preserve"> PAGEREF _Toc231916813 \h </w:instrText>
         </w:r>
         <w:r>
           <w:rPr>
@@ -1145,7 +1145,7 @@
           <w14:ligatures w14:val="standardContextual"/>
         </w:rPr>
       </w:pPr>
-      <w:hyperlink w:anchor="_Toc231914642" w:history="1">
+      <w:hyperlink w:anchor="_Toc231916814" w:history="1">
         <w:r>
           <w:rPr>
             <w:rStyle w:val="aff9"/>
@@ -1181,7 +1181,7 @@
             <w:noProof/>
             <w:webHidden/>
           </w:rPr>
-          <w:instrText xml:space="preserve"> PAGEREF _Toc231914642 \h </w:instrText>
+          <w:instrText xml:space="preserve"> PAGEREF _Toc231916814 \h </w:instrText>
         </w:r>
         <w:r>
           <w:rPr>
@@ -1230,7 +1230,7 @@
           <w14:ligatures w14:val="standardContextual"/>
         </w:rPr>
       </w:pPr>
-      <w:hyperlink w:anchor="_Toc231914643" w:history="1">
+      <w:hyperlink w:anchor="_Toc231916815" w:history="1">
         <w:r>
           <w:rPr>
             <w:rStyle w:val="aff9"/>
@@ -1266,7 +1266,7 @@
             <w:noProof/>
             <w:webHidden/>
           </w:rPr>
-          <w:instrText xml:space="preserve"> PAGEREF _Toc231914643 \h </w:instrText>
+          <w:instrText xml:space="preserve"> PAGEREF _Toc231916815 \h </w:instrText>
         </w:r>
         <w:r>
           <w:rPr>
@@ -1314,7 +1314,7 @@
           <w14:ligatures w14:val="standardContextual"/>
         </w:rPr>
       </w:pPr>
-      <w:hyperlink w:anchor="_Toc231914644" w:history="1">
+      <w:hyperlink w:anchor="_Toc231916816" w:history="1">
         <w:r>
           <w:rPr>
             <w:rStyle w:val="aff9"/>
@@ -1350,7 +1350,7 @@
             <w:noProof/>
             <w:webHidden/>
           </w:rPr>
-          <w:instrText xml:space="preserve"> PAGEREF _Toc231914644 \h </w:instrText>
+          <w:instrText xml:space="preserve"> PAGEREF _Toc231916816 \h </w:instrText>
         </w:r>
         <w:r>
           <w:rPr>
@@ -1399,7 +1399,7 @@
           <w14:ligatures w14:val="standardContextual"/>
         </w:rPr>
       </w:pPr>
-      <w:hyperlink w:anchor="_Toc231914645" w:history="1">
+      <w:hyperlink w:anchor="_Toc231916817" w:history="1">
         <w:r>
           <w:rPr>
             <w:rStyle w:val="aff9"/>
@@ -1435,7 +1435,7 @@
             <w:noProof/>
             <w:webHidden/>
           </w:rPr>
-          <w:instrText xml:space="preserve"> PAGEREF _Toc231914645 \h </w:instrText>
+          <w:instrText xml:space="preserve"> PAGEREF _Toc231916817 \h </w:instrText>
         </w:r>
         <w:r>
           <w:rPr>
@@ -1484,7 +1484,7 @@
           <w14:ligatures w14:val="standardContextual"/>
         </w:rPr>
       </w:pPr>
-      <w:hyperlink w:anchor="_Toc231914646" w:history="1">
+      <w:hyperlink w:anchor="_Toc231916818" w:history="1">
         <w:r>
           <w:rPr>
             <w:rStyle w:val="aff9"/>
@@ -1520,7 +1520,7 @@
             <w:noProof/>
             <w:webHidden/>
           </w:rPr>
-          <w:instrText xml:space="preserve"> PAGEREF _Toc231914646 \h </w:instrText>
+          <w:instrText xml:space="preserve"> PAGEREF _Toc231916818 \h </w:instrText>
         </w:r>
         <w:r>
           <w:rPr>
@@ -1569,7 +1569,7 @@
           <w14:ligatures w14:val="standardContextual"/>
         </w:rPr>
       </w:pPr>
-      <w:hyperlink w:anchor="_Toc231914647" w:history="1">
+      <w:hyperlink w:anchor="_Toc231916819" w:history="1">
         <w:r>
           <w:rPr>
             <w:rStyle w:val="aff9"/>
@@ -1605,7 +1605,7 @@
             <w:noProof/>
             <w:webHidden/>
           </w:rPr>
-          <w:instrText xml:space="preserve"> PAGEREF _Toc231914647 \h </w:instrText>
+          <w:instrText xml:space="preserve"> PAGEREF _Toc231916819 \h </w:instrText>
         </w:r>
         <w:r>
           <w:rPr>
@@ -1654,7 +1654,7 @@
           <w14:ligatures w14:val="standardContextual"/>
         </w:rPr>
       </w:pPr>
-      <w:hyperlink w:anchor="_Toc231914648" w:history="1">
+      <w:hyperlink w:anchor="_Toc231916820" w:history="1">
         <w:r>
           <w:rPr>
             <w:rStyle w:val="aff9"/>
@@ -1690,7 +1690,7 @@
             <w:noProof/>
             <w:webHidden/>
           </w:rPr>
-          <w:instrText xml:space="preserve"> PAGEREF _Toc231914648 \h </w:instrText>
+          <w:instrText xml:space="preserve"> PAGEREF _Toc231916820 \h </w:instrText>
         </w:r>
         <w:r>
           <w:rPr>
@@ -1739,7 +1739,7 @@
           <w14:ligatures w14:val="standardContextual"/>
         </w:rPr>
       </w:pPr>
-      <w:hyperlink w:anchor="_Toc231914649" w:history="1">
+      <w:hyperlink w:anchor="_Toc231916821" w:history="1">
         <w:r>
           <w:rPr>
             <w:rStyle w:val="aff9"/>
@@ -1775,7 +1775,7 @@
             <w:noProof/>
             <w:webHidden/>
           </w:rPr>
-          <w:instrText xml:space="preserve"> PAGEREF _Toc231914649 \h </w:instrText>
+          <w:instrText xml:space="preserve"> PAGEREF _Toc231916821 \h </w:instrText>
         </w:r>
         <w:r>
           <w:rPr>
@@ -1824,7 +1824,7 @@
           <w14:ligatures w14:val="standardContextual"/>
         </w:rPr>
       </w:pPr>
-      <w:hyperlink w:anchor="_Toc231914650" w:history="1">
+      <w:hyperlink w:anchor="_Toc231916822" w:history="1">
         <w:r>
           <w:rPr>
             <w:rStyle w:val="aff9"/>
@@ -1860,7 +1860,7 @@
             <w:noProof/>
             <w:webHidden/>
           </w:rPr>
-          <w:instrText xml:space="preserve"> PAGEREF _Toc231914650 \h </w:instrText>
+          <w:instrText xml:space="preserve"> PAGEREF _Toc231916822 \h </w:instrText>
         </w:r>
         <w:r>
           <w:rPr>
@@ -1908,7 +1908,7 @@
           <w14:ligatures w14:val="standardContextual"/>
         </w:rPr>
       </w:pPr>
-      <w:hyperlink w:anchor="_Toc231914651" w:history="1">
+      <w:hyperlink w:anchor="_Toc231916823" w:history="1">
         <w:r>
           <w:rPr>
             <w:rStyle w:val="aff9"/>
@@ -1944,7 +1944,7 @@
             <w:noProof/>
             <w:webHidden/>
           </w:rPr>
-          <w:instrText xml:space="preserve"> PAGEREF _Toc231914651 \h </w:instrText>
+          <w:instrText xml:space="preserve"> PAGEREF _Toc231916823 \h </w:instrText>
         </w:r>
         <w:r>
           <w:rPr>
@@ -1993,7 +1993,7 @@
           <w14:ligatures w14:val="standardContextual"/>
         </w:rPr>
       </w:pPr>
-      <w:hyperlink w:anchor="_Toc231914652" w:history="1">
+      <w:hyperlink w:anchor="_Toc231916824" w:history="1">
         <w:r>
           <w:rPr>
             <w:rStyle w:val="aff9"/>
@@ -2029,7 +2029,7 @@
             <w:noProof/>
             <w:webHidden/>
           </w:rPr>
-          <w:instrText xml:space="preserve"> PAGEREF _Toc231914652 \h </w:instrText>
+          <w:instrText xml:space="preserve"> PAGEREF _Toc231916824 \h </w:instrText>
         </w:r>
         <w:r>
           <w:rPr>
@@ -2078,7 +2078,7 @@
           <w14:ligatures w14:val="standardContextual"/>
         </w:rPr>
       </w:pPr>
-      <w:hyperlink w:anchor="_Toc231914653" w:history="1">
+      <w:hyperlink w:anchor="_Toc231916825" w:history="1">
         <w:r>
           <w:rPr>
             <w:rStyle w:val="aff9"/>
@@ -2114,7 +2114,7 @@
             <w:noProof/>
             <w:webHidden/>
           </w:rPr>
-          <w:instrText xml:space="preserve"> PAGEREF _Toc231914653 \h </w:instrText>
+          <w:instrText xml:space="preserve"> PAGEREF _Toc231916825 \h </w:instrText>
         </w:r>
         <w:r>
           <w:rPr>
@@ -2163,7 +2163,7 @@
           <w14:ligatures w14:val="standardContextual"/>
         </w:rPr>
       </w:pPr>
-      <w:hyperlink w:anchor="_Toc231914654" w:history="1">
+      <w:hyperlink w:anchor="_Toc231916826" w:history="1">
         <w:r>
           <w:rPr>
             <w:rStyle w:val="aff9"/>
@@ -2199,7 +2199,7 @@
             <w:noProof/>
             <w:webHidden/>
           </w:rPr>
-          <w:instrText xml:space="preserve"> PAGEREF _Toc231914654 \h </w:instrText>
+          <w:instrText xml:space="preserve"> PAGEREF _Toc231916826 \h </w:instrText>
         </w:r>
         <w:r>
           <w:rPr>
@@ -2248,7 +2248,7 @@
           <w14:ligatures w14:val="standardContextual"/>
         </w:rPr>
       </w:pPr>
-      <w:hyperlink w:anchor="_Toc231914655" w:history="1">
+      <w:hyperlink w:anchor="_Toc231916827" w:history="1">
         <w:r>
           <w:rPr>
             <w:rStyle w:val="aff9"/>
@@ -2284,7 +2284,7 @@
             <w:noProof/>
             <w:webHidden/>
           </w:rPr>
-          <w:instrText xml:space="preserve"> PAGEREF _Toc231914655 \h </w:instrText>
+          <w:instrText xml:space="preserve"> PAGEREF _Toc231916827 \h </w:instrText>
         </w:r>
         <w:r>
           <w:rPr>
@@ -2332,7 +2332,7 @@
           <w14:ligatures w14:val="standardContextual"/>
         </w:rPr>
       </w:pPr>
-      <w:hyperlink w:anchor="_Toc231914656" w:history="1">
+      <w:hyperlink w:anchor="_Toc231916828" w:history="1">
         <w:r>
           <w:rPr>
             <w:rStyle w:val="aff9"/>
@@ -2368,7 +2368,7 @@
             <w:noProof/>
             <w:webHidden/>
           </w:rPr>
-          <w:instrText xml:space="preserve"> PAGEREF _Toc231914656 \h </w:instrText>
+          <w:instrText xml:space="preserve"> PAGEREF _Toc231916828 \h </w:instrText>
         </w:r>
         <w:r>
           <w:rPr>
@@ -2417,7 +2417,7 @@
           <w14:ligatures w14:val="standardContextual"/>
         </w:rPr>
       </w:pPr>
-      <w:hyperlink w:anchor="_Toc231914657" w:history="1">
+      <w:hyperlink w:anchor="_Toc231916829" w:history="1">
         <w:r>
           <w:rPr>
             <w:rStyle w:val="aff9"/>
@@ -2453,7 +2453,7 @@
             <w:noProof/>
             <w:webHidden/>
           </w:rPr>
-          <w:instrText xml:space="preserve"> PAGEREF _Toc231914657 \h </w:instrText>
+          <w:instrText xml:space="preserve"> PAGEREF _Toc231916829 \h </w:instrText>
         </w:r>
         <w:r>
           <w:rPr>
@@ -2502,7 +2502,7 @@
           <w14:ligatures w14:val="standardContextual"/>
         </w:rPr>
       </w:pPr>
-      <w:hyperlink w:anchor="_Toc231914658" w:history="1">
+      <w:hyperlink w:anchor="_Toc231916830" w:history="1">
         <w:r>
           <w:rPr>
             <w:rStyle w:val="aff9"/>
@@ -2538,7 +2538,7 @@
             <w:noProof/>
             <w:webHidden/>
           </w:rPr>
-          <w:instrText xml:space="preserve"> PAGEREF _Toc231914658 \h </w:instrText>
+          <w:instrText xml:space="preserve"> PAGEREF _Toc231916830 \h </w:instrText>
         </w:r>
         <w:r>
           <w:rPr>
@@ -2587,7 +2587,7 @@
           <w14:ligatures w14:val="standardContextual"/>
         </w:rPr>
       </w:pPr>
-      <w:hyperlink w:anchor="_Toc231914659" w:history="1">
+      <w:hyperlink w:anchor="_Toc231916831" w:history="1">
         <w:r>
           <w:rPr>
             <w:rStyle w:val="aff9"/>
@@ -2623,7 +2623,7 @@
             <w:noProof/>
             <w:webHidden/>
           </w:rPr>
-          <w:instrText xml:space="preserve"> PAGEREF _Toc231914659 \h </w:instrText>
+          <w:instrText xml:space="preserve"> PAGEREF _Toc231916831 \h </w:instrText>
         </w:r>
         <w:r>
           <w:rPr>
@@ -2672,7 +2672,7 @@
           <w14:ligatures w14:val="standardContextual"/>
         </w:rPr>
       </w:pPr>
-      <w:hyperlink w:anchor="_Toc231914660" w:history="1">
+      <w:hyperlink w:anchor="_Toc231916832" w:history="1">
         <w:r>
           <w:rPr>
             <w:rStyle w:val="aff9"/>
@@ -2708,7 +2708,7 @@
             <w:noProof/>
             <w:webHidden/>
           </w:rPr>
-          <w:instrText xml:space="preserve"> PAGEREF _Toc231914660 \h </w:instrText>
+          <w:instrText xml:space="preserve"> PAGEREF _Toc231916832 \h </w:instrText>
         </w:r>
         <w:r>
           <w:rPr>
@@ -2756,7 +2756,7 @@
           <w14:ligatures w14:val="standardContextual"/>
         </w:rPr>
       </w:pPr>
-      <w:hyperlink w:anchor="_Toc231914661" w:history="1">
+      <w:hyperlink w:anchor="_Toc231916833" w:history="1">
         <w:r>
           <w:rPr>
             <w:rStyle w:val="aff9"/>
@@ -2792,7 +2792,7 @@
             <w:noProof/>
             <w:webHidden/>
           </w:rPr>
-          <w:instrText xml:space="preserve"> PAGEREF _Toc231914661 \h </w:instrText>
+          <w:instrText xml:space="preserve"> PAGEREF _Toc231916833 \h </w:instrText>
         </w:r>
         <w:r>
           <w:rPr>
@@ -2841,7 +2841,7 @@
           <w14:ligatures w14:val="standardContextual"/>
         </w:rPr>
       </w:pPr>
-      <w:hyperlink w:anchor="_Toc231914662" w:history="1">
+      <w:hyperlink w:anchor="_Toc231916834" w:history="1">
         <w:r>
           <w:rPr>
             <w:rStyle w:val="aff9"/>
@@ -2869,7 +2869,7 @@
             <w:noProof/>
             <w:webHidden/>
           </w:rPr>
-          <w:instrText xml:space="preserve"> PAGEREF _Toc231914662 \h </w:instrText>
+          <w:instrText xml:space="preserve"> PAGEREF _Toc231916834 \h </w:instrText>
         </w:r>
         <w:r>
           <w:rPr>
@@ -2918,7 +2918,7 @@
           <w14:ligatures w14:val="standardContextual"/>
         </w:rPr>
       </w:pPr>
-      <w:hyperlink w:anchor="_Toc231914663" w:history="1">
+      <w:hyperlink w:anchor="_Toc231916835" w:history="1">
         <w:r>
           <w:rPr>
             <w:rStyle w:val="aff9"/>
@@ -2954,7 +2954,7 @@
             <w:noProof/>
             <w:webHidden/>
           </w:rPr>
-          <w:instrText xml:space="preserve"> PAGEREF _Toc231914663 \h </w:instrText>
+          <w:instrText xml:space="preserve"> PAGEREF _Toc231916835 \h </w:instrText>
         </w:r>
         <w:r>
           <w:rPr>
@@ -3003,7 +3003,7 @@
           <w14:ligatures w14:val="standardContextual"/>
         </w:rPr>
       </w:pPr>
-      <w:hyperlink w:anchor="_Toc231914664" w:history="1">
+      <w:hyperlink w:anchor="_Toc231916836" w:history="1">
         <w:r>
           <w:rPr>
             <w:rStyle w:val="aff9"/>
@@ -3055,7 +3055,7 @@
             <w:noProof/>
             <w:webHidden/>
           </w:rPr>
-          <w:instrText xml:space="preserve"> PAGEREF _Toc231914664 \h </w:instrText>
+          <w:instrText xml:space="preserve"> PAGEREF _Toc231916836 \h </w:instrText>
         </w:r>
         <w:r>
           <w:rPr>
@@ -3103,7 +3103,7 @@
           <w14:ligatures w14:val="standardContextual"/>
         </w:rPr>
       </w:pPr>
-      <w:hyperlink w:anchor="_Toc231914665" w:history="1">
+      <w:hyperlink w:anchor="_Toc231916837" w:history="1">
         <w:r>
           <w:rPr>
             <w:rStyle w:val="aff9"/>
@@ -3139,7 +3139,7 @@
             <w:noProof/>
             <w:webHidden/>
           </w:rPr>
-          <w:instrText xml:space="preserve"> PAGEREF _Toc231914665 \h </w:instrText>
+          <w:instrText xml:space="preserve"> PAGEREF _Toc231916837 \h </w:instrText>
         </w:r>
         <w:r>
           <w:rPr>
@@ -3188,7 +3188,7 @@
           <w14:ligatures w14:val="standardContextual"/>
         </w:rPr>
       </w:pPr>
-      <w:hyperlink w:anchor="_Toc231914666" w:history="1">
+      <w:hyperlink w:anchor="_Toc231916838" w:history="1">
         <w:r>
           <w:rPr>
             <w:rStyle w:val="aff9"/>
@@ -3224,7 +3224,7 @@
             <w:noProof/>
             <w:webHidden/>
           </w:rPr>
-          <w:instrText xml:space="preserve"> PAGEREF _Toc231914666 \h </w:instrText>
+          <w:instrText xml:space="preserve"> PAGEREF _Toc231916838 \h </w:instrText>
         </w:r>
         <w:r>
           <w:rPr>
@@ -3273,7 +3273,7 @@
           <w14:ligatures w14:val="standardContextual"/>
         </w:rPr>
       </w:pPr>
-      <w:hyperlink w:anchor="_Toc231914667" w:history="1">
+      <w:hyperlink w:anchor="_Toc231916839" w:history="1">
         <w:r>
           <w:rPr>
             <w:rStyle w:val="aff9"/>
@@ -3309,7 +3309,7 @@
             <w:noProof/>
             <w:webHidden/>
           </w:rPr>
-          <w:instrText xml:space="preserve"> PAGEREF _Toc231914667 \h </w:instrText>
+          <w:instrText xml:space="preserve"> PAGEREF _Toc231916839 \h </w:instrText>
         </w:r>
         <w:r>
           <w:rPr>
@@ -3357,7 +3357,7 @@
           <w14:ligatures w14:val="standardContextual"/>
         </w:rPr>
       </w:pPr>
-      <w:hyperlink w:anchor="_Toc231914668" w:history="1">
+      <w:hyperlink w:anchor="_Toc231916840" w:history="1">
         <w:r>
           <w:rPr>
             <w:rStyle w:val="aff9"/>
@@ -3393,7 +3393,7 @@
             <w:noProof/>
             <w:webHidden/>
           </w:rPr>
-          <w:instrText xml:space="preserve"> PAGEREF _Toc231914668 \h </w:instrText>
+          <w:instrText xml:space="preserve"> PAGEREF _Toc231916840 \h </w:instrText>
         </w:r>
         <w:r>
           <w:rPr>
@@ -3441,7 +3441,7 @@
           <w14:ligatures w14:val="standardContextual"/>
         </w:rPr>
       </w:pPr>
-      <w:hyperlink w:anchor="_Toc231914669" w:history="1">
+      <w:hyperlink w:anchor="_Toc231916841" w:history="1">
         <w:r>
           <w:rPr>
             <w:rStyle w:val="aff9"/>
@@ -3477,7 +3477,7 @@
             <w:noProof/>
             <w:webHidden/>
           </w:rPr>
-          <w:instrText xml:space="preserve"> PAGEREF _Toc231914669 \h </w:instrText>
+          <w:instrText xml:space="preserve"> PAGEREF _Toc231916841 \h </w:instrText>
         </w:r>
         <w:r>
           <w:rPr>
@@ -3525,7 +3525,7 @@
           <w14:ligatures w14:val="standardContextual"/>
         </w:rPr>
       </w:pPr>
-      <w:hyperlink w:anchor="_Toc231914670" w:history="1">
+      <w:hyperlink w:anchor="_Toc231916842" w:history="1">
         <w:r>
           <w:rPr>
             <w:rStyle w:val="aff9"/>
@@ -3553,7 +3553,7 @@
             <w:noProof/>
             <w:webHidden/>
           </w:rPr>
-          <w:instrText xml:space="preserve"> PAGEREF _Toc231914670 \h </w:instrText>
+          <w:instrText xml:space="preserve"> PAGEREF _Toc231916842 \h </w:instrText>
         </w:r>
         <w:r>
           <w:rPr>
@@ -3629,7 +3629,7 @@
           <w:lang w:eastAsia="zh-CN"/>
         </w:rPr>
       </w:pPr>
-      <w:bookmarkStart w:id="0" w:name="_Toc231914635"/>
+      <w:bookmarkStart w:id="0" w:name="_Toc231916807"/>
       <w:r>
         <w:rPr>
           <w:rFonts w:ascii="Times New Roman" w:eastAsia="黑体" w:hAnsi="Times New Roman"/>
@@ -3645,6 +3645,9 @@
         <w:spacing w:after="120" w:line="400" w:lineRule="exact"/>
         <w:ind w:firstLine="420"/>
         <w:jc w:val="both"/>
+        <w:rPr>
+          <w:lang w:eastAsia="zh-CN"/>
+        </w:rPr>
       </w:pPr>
       <w:r>
         <w:rPr>
@@ -3698,15 +3701,167 @@
         <w:rPr>
           <w:lang w:eastAsia="zh-CN"/>
         </w:rPr>
-        <w:t>股指期货）的吃贴水与跨期套利策略。</w:t>
+        <w:t>股指期货）的吃贴水与跨期套利策略。结论可以先概括为一句话：</w:t>
+      </w:r>
+      <w:r>
+        <w:rPr>
+          <w:b/>
+          <w:lang w:eastAsia="zh-CN"/>
+        </w:rPr>
+        <w:t>贴水确实提供了历史补偿，但它不是低风险套利；跨期价差存在交易线索，却还不足以单独支撑主策略。</w:t>
+      </w:r>
+    </w:p>
+    <w:p>
+      <w:pPr>
+        <w:pStyle w:val="a0"/>
+        <w:spacing w:after="60" w:line="400" w:lineRule="exact"/>
+        <w:jc w:val="both"/>
+      </w:pPr>
+      <w:r>
+        <w:rPr>
+          <w:b/>
+          <w:lang w:eastAsia="zh-CN"/>
+        </w:rPr>
+        <w:t>吃贴水策略有经济收益。</w:t>
+      </w:r>
+      <w:r>
+        <w:rPr>
+          <w:lang w:eastAsia="zh-CN"/>
+        </w:rPr>
+        <w:t xml:space="preserve"> </w:t>
+      </w:r>
+      <w:r>
+        <w:t xml:space="preserve">IC Always </w:t>
       </w:r>
       <w:proofErr w:type="spellStart"/>
       <w:r>
-        <w:t>核心发现</w:t>
+        <w:t>年化收益</w:t>
       </w:r>
       <w:proofErr w:type="spellEnd"/>
       <w:r>
-        <w:t>：</w:t>
+        <w:t xml:space="preserve"> 9.62%</w:t>
+      </w:r>
+      <w:r>
+        <w:t>（</w:t>
+      </w:r>
+      <w:proofErr w:type="spellStart"/>
+      <w:r>
+        <w:t>指数</w:t>
+      </w:r>
+      <w:proofErr w:type="spellEnd"/>
+      <w:r>
+        <w:t xml:space="preserve"> 0.83%</w:t>
+      </w:r>
+      <w:r>
+        <w:t>），</w:t>
+      </w:r>
+      <w:r>
+        <w:t xml:space="preserve">IM Always </w:t>
+      </w:r>
+      <w:proofErr w:type="spellStart"/>
+      <w:r>
+        <w:t>年化收益</w:t>
+      </w:r>
+      <w:proofErr w:type="spellEnd"/>
+      <w:r>
+        <w:t xml:space="preserve"> 15.88%</w:t>
+      </w:r>
+      <w:r>
+        <w:t>（</w:t>
+      </w:r>
+      <w:proofErr w:type="spellStart"/>
+      <w:r>
+        <w:t>指数</w:t>
+      </w:r>
+      <w:proofErr w:type="spellEnd"/>
+      <w:r>
+        <w:t xml:space="preserve"> 5.31%</w:t>
+      </w:r>
+      <w:r>
+        <w:t>）。</w:t>
+      </w:r>
+      <w:proofErr w:type="spellStart"/>
+      <w:r>
+        <w:t>这部分超额主要来自期货长期贴水下的基差收敛和展期补偿</w:t>
+      </w:r>
+      <w:proofErr w:type="spellEnd"/>
+      <w:r>
+        <w:t>。</w:t>
+      </w:r>
+    </w:p>
+    <w:p>
+      <w:pPr>
+        <w:pStyle w:val="a0"/>
+        <w:spacing w:after="60" w:line="400" w:lineRule="exact"/>
+        <w:jc w:val="both"/>
+        <w:rPr>
+          <w:lang w:eastAsia="zh-CN"/>
+        </w:rPr>
+      </w:pPr>
+      <w:r>
+        <w:rPr>
+          <w:b/>
+          <w:lang w:eastAsia="zh-CN"/>
+        </w:rPr>
+        <w:t>收益背后承担了较高方向风险。</w:t>
+      </w:r>
+      <w:r>
+        <w:rPr>
+          <w:lang w:eastAsia="zh-CN"/>
+        </w:rPr>
+        <w:t xml:space="preserve"> </w:t>
+      </w:r>
+      <w:r>
+        <w:t xml:space="preserve">IC Always </w:t>
+      </w:r>
+      <w:proofErr w:type="spellStart"/>
+      <w:r>
+        <w:t>最大回撤</w:t>
+      </w:r>
+      <w:proofErr w:type="spellEnd"/>
+      <w:r>
+        <w:t xml:space="preserve"> -61.38%</w:t>
+      </w:r>
+      <w:r>
+        <w:t>，</w:t>
+      </w:r>
+      <w:r>
+        <w:t>IM Always -50.81%</w:t>
+      </w:r>
+      <w:r>
+        <w:t>。</w:t>
+      </w:r>
+      <w:proofErr w:type="gramStart"/>
+      <w:r>
+        <w:rPr>
+          <w:lang w:eastAsia="zh-CN"/>
+        </w:rPr>
+        <w:t>策略更接近</w:t>
+      </w:r>
+      <w:r>
+        <w:rPr>
+          <w:lang w:eastAsia="zh-CN"/>
+        </w:rPr>
+        <w:t>“</w:t>
+      </w:r>
+      <w:proofErr w:type="gramEnd"/>
+      <w:r>
+        <w:rPr>
+          <w:lang w:eastAsia="zh-CN"/>
+        </w:rPr>
+        <w:t>用股指期货替代指数多头并获取贴水补偿</w:t>
+      </w:r>
+      <w:r>
+        <w:rPr>
+          <w:lang w:eastAsia="zh-CN"/>
+        </w:rPr>
+        <w:t>”</w:t>
+      </w:r>
+      <w:r>
+        <w:rPr>
+          <w:lang w:eastAsia="zh-CN"/>
+        </w:rPr>
+        <w:t>，不是市场中性套利。</w:t>
       </w:r>
     </w:p>
     <w:p>
@@ -3717,61 +3872,97 @@
       </w:pPr>
       <w:proofErr w:type="spellStart"/>
       <w:r>
-        <w:t>吃贴水策略跑赢指数。</w:t>
+        <w:rPr>
+          <w:b/>
+        </w:rPr>
+        <w:t>统计证据偏弱</w:t>
+      </w:r>
+      <w:proofErr w:type="spellEnd"/>
+      <w:r>
+        <w:rPr>
+          <w:b/>
+        </w:rPr>
+        <w:t>。</w:t>
+      </w:r>
+      <w:r>
+        <w:t xml:space="preserve"> Block Bootstrap </w:t>
+      </w:r>
+      <w:proofErr w:type="spellStart"/>
+      <w:r>
+        <w:t>检验下，</w:t>
       </w:r>
       <w:r>
         <w:t>IC</w:t>
       </w:r>
       <w:proofErr w:type="spellEnd"/>
       <w:r>
-        <w:t xml:space="preserve"> Always </w:t>
+        <w:t xml:space="preserve"> Sharpe </w:t>
       </w:r>
       <w:proofErr w:type="spellStart"/>
       <w:r>
-        <w:t>年化收益</w:t>
+        <w:t>差异</w:t>
       </w:r>
       <w:proofErr w:type="spellEnd"/>
       <w:r>
-        <w:t xml:space="preserve"> 9.62%</w:t>
-      </w:r>
-      <w:r>
-        <w:t>（</w:t>
+        <w:t xml:space="preserve"> 95% CI </w:t>
+      </w:r>
+      <w:r>
+        <w:t>为</w:t>
+      </w:r>
+      <w:r>
+        <w:t xml:space="preserve"> [-0.1669, 0.</w:t>
+      </w:r>
+      <w:proofErr w:type="gramStart"/>
+      <w:r>
+        <w:t>8246]</w:t>
+      </w:r>
+      <w:r>
+        <w:t>，</w:t>
+      </w:r>
+      <w:proofErr w:type="gramEnd"/>
+      <w:r>
+        <w:t>p = 0.1980</w:t>
+      </w:r>
+      <w:r>
+        <w:t>；</w:t>
+      </w:r>
+      <w:r>
+        <w:t xml:space="preserve">IM </w:t>
+      </w:r>
+      <w:r>
+        <w:t>为</w:t>
+      </w:r>
+      <w:r>
+        <w:t xml:space="preserve"> [-0.4077, 1.0583]</w:t>
+      </w:r>
+      <w:r>
+        <w:t>，</w:t>
+      </w:r>
+      <w:r>
+        <w:t>p = 0.4100</w:t>
+      </w:r>
+      <w:r>
+        <w:t>。两个置信区间均覆盖</w:t>
+      </w:r>
+      <w:r>
+        <w:t xml:space="preserve"> 0</w:t>
+      </w:r>
+      <w:r>
+        <w:t>，不能拒绝</w:t>
+      </w:r>
+      <w:r>
+        <w:t xml:space="preserve">“Sharpe </w:t>
       </w:r>
       <w:proofErr w:type="spellStart"/>
       <w:r>
-        <w:t>指数</w:t>
+        <w:t>差异为</w:t>
       </w:r>
       <w:proofErr w:type="spellEnd"/>
       <w:r>
-        <w:t xml:space="preserve"> 0.83%</w:t>
-      </w:r>
-      <w:r>
-        <w:t>），</w:t>
-      </w:r>
-      <w:r>
-        <w:t>IM Always 15.88%</w:t>
-      </w:r>
-      <w:r>
-        <w:t>（</w:t>
-      </w:r>
-      <w:proofErr w:type="spellStart"/>
-      <w:r>
-        <w:t>指数</w:t>
-      </w:r>
-      <w:proofErr w:type="spellEnd"/>
-      <w:r>
-        <w:t xml:space="preserve"> 5.31%</w:t>
-      </w:r>
-      <w:r>
-        <w:t>），</w:t>
-      </w:r>
-      <w:proofErr w:type="spellStart"/>
-      <w:r>
-        <w:t>超额来自期货贴水结构下的基差收敛与展期补偿</w:t>
-      </w:r>
-      <w:proofErr w:type="spellEnd"/>
-      <w:r>
-        <w:t>。</w:t>
+        <w:t xml:space="preserve"> 0”</w:t>
+      </w:r>
+      <w:r>
+        <w:t>的原假设。</w:t>
       </w:r>
     </w:p>
     <w:p>
@@ -3779,42 +3970,92 @@
         <w:pStyle w:val="a0"/>
         <w:spacing w:after="60" w:line="400" w:lineRule="exact"/>
         <w:jc w:val="both"/>
+        <w:rPr>
+          <w:lang w:eastAsia="zh-CN"/>
+        </w:rPr>
       </w:pPr>
+      <w:r>
+        <w:rPr>
+          <w:b/>
+          <w:lang w:eastAsia="zh-CN"/>
+        </w:rPr>
+        <w:t>跨期套利有边际改善，但收益厚度有限。</w:t>
+      </w:r>
+      <w:r>
+        <w:rPr>
+          <w:lang w:eastAsia="zh-CN"/>
+        </w:rPr>
+        <w:t xml:space="preserve"> </w:t>
+      </w:r>
       <w:proofErr w:type="spellStart"/>
       <w:r>
-        <w:t>超额不等于低风险。</w:t>
-      </w:r>
-      <w:r>
-        <w:t>IC</w:t>
+        <w:t>采用期限结构斜率后，固定规则下</w:t>
       </w:r>
       <w:proofErr w:type="spellEnd"/>
       <w:r>
-        <w:t xml:space="preserve"> Always </w:t>
+        <w:t xml:space="preserve"> IC </w:t>
       </w:r>
       <w:proofErr w:type="spellStart"/>
       <w:r>
-        <w:t>最大回撤</w:t>
+        <w:t>年化</w:t>
       </w:r>
       <w:proofErr w:type="spellEnd"/>
       <w:r>
-        <w:t xml:space="preserve"> -61.38%</w:t>
+        <w:t xml:space="preserve"> 0.14%</w:t>
+      </w:r>
+      <w:r>
+        <w:t>、</w:t>
+      </w:r>
+      <w:r>
+        <w:t>Sharpe(0RF) 0.03</w:t>
       </w:r>
       <w:r>
         <w:t>，</w:t>
       </w:r>
       <w:r>
-        <w:t>IM Always -50.81%</w:t>
-      </w:r>
-      <w:r>
-        <w:t>，</w:t>
+        <w:t xml:space="preserve">IM </w:t>
       </w:r>
       <w:proofErr w:type="spellStart"/>
       <w:r>
-        <w:t>策略本质是指数多头替代而非市场中性套利</w:t>
+        <w:t>年化</w:t>
       </w:r>
       <w:proofErr w:type="spellEnd"/>
       <w:r>
+        <w:t xml:space="preserve"> 2.30%</w:t>
+      </w:r>
+      <w:r>
+        <w:t>、</w:t>
+      </w:r>
+      <w:r>
+        <w:t>Sharpe(0RF) 0.64</w:t>
+      </w:r>
+      <w:r>
+        <w:t>；若扣除</w:t>
+      </w:r>
+      <w:r>
+        <w:t xml:space="preserve"> 3% </w:t>
+      </w:r>
+      <w:proofErr w:type="spellStart"/>
+      <w:r>
+        <w:t>资金门槛，两者</w:t>
+      </w:r>
+      <w:proofErr w:type="spellEnd"/>
+      <w:r>
+        <w:t xml:space="preserve"> Sharpe </w:t>
+      </w:r>
+      <w:proofErr w:type="spellStart"/>
+      <w:r>
+        <w:t>均为负</w:t>
+      </w:r>
+      <w:proofErr w:type="spellEnd"/>
+      <w:r>
         <w:t>。</w:t>
+      </w:r>
+      <w:r>
+        <w:rPr>
+          <w:lang w:eastAsia="zh-CN"/>
+        </w:rPr>
+        <w:t>该模块可以作为补充研究，不适合作为主收益来源。</w:t>
       </w:r>
     </w:p>
     <w:p>
@@ -3822,72 +4063,72 @@
         <w:pStyle w:val="a0"/>
         <w:spacing w:after="60" w:line="400" w:lineRule="exact"/>
         <w:jc w:val="both"/>
+        <w:rPr>
+          <w:lang w:eastAsia="zh-CN"/>
+        </w:rPr>
       </w:pPr>
       <w:r>
-        <w:t xml:space="preserve">Block Bootstrap </w:t>
-      </w:r>
-      <w:proofErr w:type="spellStart"/>
-      <w:r>
-        <w:t>检验：</w:t>
-      </w:r>
-      <w:r>
-        <w:t>IC</w:t>
-      </w:r>
-      <w:proofErr w:type="spellEnd"/>
-      <w:r>
-        <w:t xml:space="preserve"> Sharpe </w:t>
-      </w:r>
-      <w:proofErr w:type="spellStart"/>
-      <w:r>
-        <w:t>差异</w:t>
-      </w:r>
-      <w:proofErr w:type="spellEnd"/>
-      <w:r>
-        <w:t xml:space="preserve"> 95% CI [-0.1669, 0.</w:t>
+        <w:rPr>
+          <w:b/>
+          <w:lang w:eastAsia="zh-CN"/>
+        </w:rPr>
+        <w:t>品种组合分散作用有限。</w:t>
+      </w:r>
+      <w:r>
+        <w:rPr>
+          <w:lang w:eastAsia="zh-CN"/>
+        </w:rPr>
+        <w:t xml:space="preserve"> IC </w:t>
+      </w:r>
+      <w:r>
+        <w:rPr>
+          <w:lang w:eastAsia="zh-CN"/>
+        </w:rPr>
+        <w:t>与</w:t>
+      </w:r>
+      <w:r>
+        <w:rPr>
+          <w:lang w:eastAsia="zh-CN"/>
+        </w:rPr>
+        <w:t xml:space="preserve"> IM </w:t>
       </w:r>
       <w:proofErr w:type="gramStart"/>
       <w:r>
-        <w:t>8246]</w:t>
-      </w:r>
-      <w:r>
-        <w:t>，</w:t>
+        <w:rPr>
+          <w:lang w:eastAsia="zh-CN"/>
+        </w:rPr>
+        <w:t>日收益</w:t>
       </w:r>
       <w:proofErr w:type="gramEnd"/>
       <w:r>
-        <w:t>p = 0.1980</w:t>
-      </w:r>
-      <w:r>
-        <w:t>；</w:t>
-      </w:r>
-      <w:r>
-        <w:t>IM CI [-0.4077, 1.0583]</w:t>
-      </w:r>
-      <w:r>
-        <w:t>，</w:t>
-      </w:r>
-      <w:r>
-        <w:t>p = 0.4100</w:t>
-      </w:r>
-      <w:r>
-        <w:t>。置信区间覆盖</w:t>
-      </w:r>
-      <w:r>
-        <w:t xml:space="preserve"> 0</w:t>
-      </w:r>
-      <w:r>
-        <w:t>，统计上不能拒绝</w:t>
-      </w:r>
-      <w:r>
-        <w:t>"</w:t>
-      </w:r>
-      <w:r>
-        <w:t>超额为</w:t>
-      </w:r>
-      <w:r>
-        <w:t xml:space="preserve"> 0"</w:t>
-      </w:r>
-      <w:r>
-        <w:t>的原假设。</w:t>
+        <w:rPr>
+          <w:lang w:eastAsia="zh-CN"/>
+        </w:rPr>
+        <w:t>相关性约</w:t>
+      </w:r>
+      <w:r>
+        <w:rPr>
+          <w:lang w:eastAsia="zh-CN"/>
+        </w:rPr>
+        <w:t xml:space="preserve"> 0.95</w:t>
+      </w:r>
+      <w:r>
+        <w:rPr>
+          <w:lang w:eastAsia="zh-CN"/>
+        </w:rPr>
+        <w:t>，同属中小盘权益</w:t>
+      </w:r>
+      <w:r>
+        <w:rPr>
+          <w:lang w:eastAsia="zh-CN"/>
+        </w:rPr>
+        <w:t xml:space="preserve"> beta</w:t>
+      </w:r>
+      <w:r>
+        <w:rPr>
+          <w:lang w:eastAsia="zh-CN"/>
+        </w:rPr>
+        <w:t>，简单组合难以明显降低波动。</w:t>
       </w:r>
     </w:p>
     <w:p>
@@ -3901,69 +4142,48 @@
       </w:pPr>
       <w:r>
         <w:rPr>
-          <w:lang w:eastAsia="zh-CN"/>
-        </w:rPr>
-        <w:t>跨期套利（日频</w:t>
-      </w:r>
-      <w:r>
-        <w:rPr>
-          <w:lang w:eastAsia="zh-CN"/>
-        </w:rPr>
-        <w:t xml:space="preserve"> T+1</w:t>
-      </w:r>
-      <w:r>
-        <w:rPr>
-          <w:lang w:eastAsia="zh-CN"/>
-        </w:rPr>
-        <w:t>）不可行：</w:t>
-      </w:r>
-      <w:r>
-        <w:rPr>
-          <w:lang w:eastAsia="zh-CN"/>
-        </w:rPr>
-        <w:t xml:space="preserve">IC </w:t>
-      </w:r>
-      <w:r>
-        <w:rPr>
-          <w:lang w:eastAsia="zh-CN"/>
-        </w:rPr>
-        <w:t>和</w:t>
-      </w:r>
-      <w:r>
-        <w:rPr>
-          <w:lang w:eastAsia="zh-CN"/>
-        </w:rPr>
-        <w:t xml:space="preserve"> IM </w:t>
-      </w:r>
-      <w:r>
-        <w:rPr>
-          <w:lang w:eastAsia="zh-CN"/>
-        </w:rPr>
-        <w:t>各</w:t>
-      </w:r>
-      <w:r>
-        <w:rPr>
-          <w:lang w:eastAsia="zh-CN"/>
-        </w:rPr>
-        <w:t xml:space="preserve"> 16 </w:t>
-      </w:r>
-      <w:r>
-        <w:rPr>
-          <w:lang w:eastAsia="zh-CN"/>
-        </w:rPr>
-        <w:t>组参数扫描，均无正</w:t>
-      </w:r>
-      <w:r>
-        <w:rPr>
-          <w:lang w:eastAsia="zh-CN"/>
-        </w:rPr>
-        <w:t xml:space="preserve"> Sharpe</w:t>
-      </w:r>
-      <w:r>
-        <w:rPr>
-          <w:lang w:eastAsia="zh-CN"/>
-        </w:rPr>
-        <w:t>。限制不在参数选择，在日频收盘价下价差可捕捉偏离太少。</w:t>
+          <w:b/>
+          <w:lang w:eastAsia="zh-CN"/>
+        </w:rPr>
+        <w:t>风险控制能降回撤，但会消耗收益。</w:t>
+      </w:r>
+      <w:r>
+        <w:rPr>
+          <w:lang w:eastAsia="zh-CN"/>
+        </w:rPr>
+        <w:t xml:space="preserve"> </w:t>
+      </w:r>
+      <w:r>
+        <w:rPr>
+          <w:lang w:eastAsia="zh-CN"/>
+        </w:rPr>
+        <w:t>波动率目标和回撤控制版本的</w:t>
+      </w:r>
+      <w:r>
+        <w:rPr>
+          <w:lang w:eastAsia="zh-CN"/>
+        </w:rPr>
+        <w:t xml:space="preserve"> Sharpe </w:t>
+      </w:r>
+      <w:r>
+        <w:rPr>
+          <w:lang w:eastAsia="zh-CN"/>
+        </w:rPr>
+        <w:t>均为负，说明贴水补偿不够厚，难以同时满足</w:t>
+      </w:r>
+      <w:proofErr w:type="gramStart"/>
+      <w:r>
+        <w:rPr>
+          <w:lang w:eastAsia="zh-CN"/>
+        </w:rPr>
+        <w:t>低回撤和高</w:t>
+      </w:r>
+      <w:proofErr w:type="gramEnd"/>
+      <w:r>
+        <w:rPr>
+          <w:lang w:eastAsia="zh-CN"/>
+        </w:rPr>
+        <w:t>收益。</w:t>
       </w:r>
     </w:p>
     <w:p>
@@ -3977,121 +4197,46 @@
       </w:pPr>
       <w:r>
         <w:rPr>
-          <w:lang w:eastAsia="zh-CN"/>
-        </w:rPr>
-        <w:t>组合策略的分散化价值有限：</w:t>
-      </w:r>
-      <w:r>
-        <w:rPr>
-          <w:lang w:eastAsia="zh-CN"/>
-        </w:rPr>
-        <w:t xml:space="preserve">IC </w:t>
-      </w:r>
-      <w:r>
-        <w:rPr>
-          <w:lang w:eastAsia="zh-CN"/>
-        </w:rPr>
-        <w:t>与</w:t>
-      </w:r>
-      <w:r>
-        <w:rPr>
-          <w:lang w:eastAsia="zh-CN"/>
-        </w:rPr>
-        <w:t xml:space="preserve"> IM </w:t>
-      </w:r>
-      <w:proofErr w:type="gramStart"/>
-      <w:r>
-        <w:rPr>
-          <w:lang w:eastAsia="zh-CN"/>
-        </w:rPr>
-        <w:t>日收益</w:t>
-      </w:r>
-      <w:proofErr w:type="gramEnd"/>
-      <w:r>
-        <w:rPr>
-          <w:lang w:eastAsia="zh-CN"/>
-        </w:rPr>
-        <w:t>相关性约</w:t>
-      </w:r>
-      <w:r>
-        <w:rPr>
-          <w:lang w:eastAsia="zh-CN"/>
-        </w:rPr>
-        <w:t xml:space="preserve"> 0.95</w:t>
-      </w:r>
-      <w:r>
-        <w:rPr>
-          <w:lang w:eastAsia="zh-CN"/>
-        </w:rPr>
-        <w:t>，品种组合不能有效降低波动。</w:t>
-      </w:r>
-    </w:p>
-    <w:p>
-      <w:pPr>
-        <w:pStyle w:val="a0"/>
-        <w:spacing w:after="60" w:line="400" w:lineRule="exact"/>
-        <w:jc w:val="both"/>
-        <w:rPr>
-          <w:lang w:eastAsia="zh-CN"/>
-        </w:rPr>
-      </w:pPr>
-      <w:r>
-        <w:rPr>
-          <w:lang w:eastAsia="zh-CN"/>
-        </w:rPr>
-        <w:t>风险控制（波动率目标</w:t>
-      </w:r>
-      <w:r>
-        <w:rPr>
-          <w:lang w:eastAsia="zh-CN"/>
-        </w:rPr>
-        <w:t>/</w:t>
-      </w:r>
-      <w:r>
-        <w:rPr>
-          <w:lang w:eastAsia="zh-CN"/>
-        </w:rPr>
-        <w:t>回撤控制）可降回撤，但夏普全部转负</w:t>
-      </w:r>
-      <w:r>
-        <w:rPr>
-          <w:lang w:eastAsia="zh-CN"/>
-        </w:rPr>
-        <w:t>——</w:t>
-      </w:r>
-      <w:r>
-        <w:rPr>
-          <w:lang w:eastAsia="zh-CN"/>
-        </w:rPr>
-        <w:t>贴水补偿的厚度不足以支撑降杠杆后的交易摩擦。</w:t>
-      </w:r>
-    </w:p>
-    <w:p>
-      <w:pPr>
-        <w:pStyle w:val="a0"/>
-        <w:spacing w:after="60" w:line="400" w:lineRule="exact"/>
-        <w:jc w:val="both"/>
-        <w:rPr>
-          <w:lang w:eastAsia="zh-CN"/>
-        </w:rPr>
-      </w:pPr>
-      <w:r>
-        <w:rPr>
-          <w:lang w:eastAsia="zh-CN"/>
-        </w:rPr>
-        <w:t>本研究从原始数据出发，</w:t>
-      </w:r>
-      <w:r>
-        <w:rPr>
-          <w:lang w:eastAsia="zh-CN"/>
-        </w:rPr>
-        <w:t xml:space="preserve">Notebook </w:t>
-      </w:r>
-      <w:r>
-        <w:rPr>
-          <w:lang w:eastAsia="zh-CN"/>
-        </w:rPr>
-        <w:t>可从头执行复现，所有参数和随机种子固定。</w:t>
+          <w:b/>
+          <w:lang w:eastAsia="zh-CN"/>
+        </w:rPr>
+        <w:t>可复现性较好。</w:t>
+      </w:r>
+      <w:r>
+        <w:rPr>
+          <w:lang w:eastAsia="zh-CN"/>
+        </w:rPr>
+        <w:t xml:space="preserve"> </w:t>
+      </w:r>
+      <w:r>
+        <w:rPr>
+          <w:lang w:eastAsia="zh-CN"/>
+        </w:rPr>
+        <w:t>研究从原始</w:t>
+      </w:r>
+      <w:r>
+        <w:rPr>
+          <w:lang w:eastAsia="zh-CN"/>
+        </w:rPr>
+        <w:t xml:space="preserve"> Excel </w:t>
+      </w:r>
+      <w:r>
+        <w:rPr>
+          <w:lang w:eastAsia="zh-CN"/>
+        </w:rPr>
+        <w:t>数据开始，数据清洗、回测、统计检验、归因和图表输出均在</w:t>
+      </w:r>
+      <w:r>
+        <w:rPr>
+          <w:lang w:eastAsia="zh-CN"/>
+        </w:rPr>
+        <w:t xml:space="preserve"> Notebook </w:t>
+      </w:r>
+      <w:r>
+        <w:rPr>
+          <w:lang w:eastAsia="zh-CN"/>
+        </w:rPr>
+        <w:t>中完成，关键随机过程固定种子。</w:t>
       </w:r>
     </w:p>
     <w:p>
@@ -4697,7 +4842,7 @@
           <w:lang w:eastAsia="zh-CN"/>
         </w:rPr>
       </w:pPr>
-      <w:bookmarkStart w:id="1" w:name="_Toc231914636"/>
+      <w:bookmarkStart w:id="1" w:name="_Toc231916808"/>
       <w:r>
         <w:rPr>
           <w:rFonts w:ascii="Times New Roman" w:eastAsia="黑体" w:hAnsi="Times New Roman"/>
@@ -4735,7 +4880,7 @@
           <w:lang w:eastAsia="zh-CN"/>
         </w:rPr>
       </w:pPr>
-      <w:bookmarkStart w:id="2" w:name="_Toc231914637"/>
+      <w:bookmarkStart w:id="2" w:name="_Toc231916809"/>
       <w:r>
         <w:rPr>
           <w:rFonts w:ascii="Times New Roman" w:eastAsia="黑体" w:hAnsi="Times New Roman"/>
@@ -5934,7 +6079,7 @@
         <w:rPr>
           <w:lang w:eastAsia="zh-CN"/>
         </w:rPr>
-        <w:t>本报告所有数据均来源于</w:t>
+        <w:t>数据均来源于</w:t>
       </w:r>
       <w:r>
         <w:rPr>
@@ -5972,7 +6117,7 @@
         <w:rPr>
           <w:lang w:eastAsia="zh-CN"/>
         </w:rPr>
-        <w:t>文件，指标计算与策略</w:t>
+        <w:t>文件。指标计算与策略</w:t>
       </w:r>
       <w:proofErr w:type="gramStart"/>
       <w:r>
@@ -5992,7 +6137,61 @@
         <w:rPr>
           <w:lang w:eastAsia="zh-CN"/>
         </w:rPr>
-        <w:t>中完成。后续表格不再重复说明数据出处。</w:t>
+        <w:t>中完成；报告中的核心数字以</w:t>
+      </w:r>
+      <w:r>
+        <w:rPr>
+          <w:lang w:eastAsia="zh-CN"/>
+        </w:rPr>
+        <w:t xml:space="preserve"> </w:t>
+      </w:r>
+      <w:r>
+        <w:rPr>
+          <w:rFonts w:ascii="Consolas" w:hAnsi="Consolas"/>
+          <w:color w:val="555555"/>
+          <w:sz w:val="23"/>
+          <w:lang w:eastAsia="zh-CN"/>
+        </w:rPr>
+        <w:t>output/tables/</w:t>
+      </w:r>
+      <w:r>
+        <w:rPr>
+          <w:lang w:eastAsia="zh-CN"/>
+        </w:rPr>
+        <w:t xml:space="preserve"> </w:t>
+      </w:r>
+      <w:r>
+        <w:rPr>
+          <w:lang w:eastAsia="zh-CN"/>
+        </w:rPr>
+        <w:t>和</w:t>
+      </w:r>
+      <w:r>
+        <w:rPr>
+          <w:lang w:eastAsia="zh-CN"/>
+        </w:rPr>
+        <w:t xml:space="preserve"> </w:t>
+      </w:r>
+      <w:r>
+        <w:rPr>
+          <w:rFonts w:ascii="Consolas" w:hAnsi="Consolas"/>
+          <w:color w:val="555555"/>
+          <w:sz w:val="23"/>
+          <w:lang w:eastAsia="zh-CN"/>
+        </w:rPr>
+        <w:t>output/validation_summary.csv</w:t>
+      </w:r>
+      <w:r>
+        <w:rPr>
+          <w:lang w:eastAsia="zh-CN"/>
+        </w:rPr>
+        <w:t xml:space="preserve"> </w:t>
+      </w:r>
+      <w:r>
+        <w:rPr>
+          <w:lang w:eastAsia="zh-CN"/>
+        </w:rPr>
+        <w:t>为核对口径。</w:t>
       </w:r>
     </w:p>
     <w:p>
@@ -6003,7 +6202,7 @@
           <w:lang w:eastAsia="zh-CN"/>
         </w:rPr>
       </w:pPr>
-      <w:bookmarkStart w:id="3" w:name="_Toc231914638"/>
+      <w:bookmarkStart w:id="3" w:name="_Toc231916810"/>
       <w:r>
         <w:rPr>
           <w:rFonts w:ascii="Times New Roman" w:eastAsia="黑体" w:hAnsi="Times New Roman"/>
@@ -6426,6 +6625,7 @@
               <w:rPr>
                 <w:sz w:val="21"/>
               </w:rPr>
+              <w:lastRenderedPageBreak/>
               <w:t>成本</w:t>
             </w:r>
             <w:proofErr w:type="spellEnd"/>
@@ -6493,7 +6693,6 @@
               <w:rPr>
                 <w:sz w:val="21"/>
               </w:rPr>
-              <w:lastRenderedPageBreak/>
               <w:t>逐日盯市</w:t>
             </w:r>
             <w:proofErr w:type="spellEnd"/>
@@ -6632,7 +6831,7 @@
           <w:lang w:eastAsia="zh-CN"/>
         </w:rPr>
       </w:pPr>
-      <w:bookmarkStart w:id="4" w:name="_Toc231914639"/>
+      <w:bookmarkStart w:id="4" w:name="_Toc231916811"/>
       <w:r>
         <w:rPr>
           <w:rFonts w:ascii="Times New Roman" w:eastAsia="黑体" w:hAnsi="Times New Roman"/>
@@ -7009,7 +7208,7 @@
           <w:lang w:eastAsia="zh-CN"/>
         </w:rPr>
       </w:pPr>
-      <w:bookmarkStart w:id="5" w:name="_Toc231914640"/>
+      <w:bookmarkStart w:id="5" w:name="_Toc231916812"/>
       <w:r>
         <w:rPr>
           <w:rFonts w:ascii="Times New Roman" w:eastAsia="黑体" w:hAnsi="Times New Roman"/>
@@ -7039,7 +7238,7 @@
           <w:lang w:eastAsia="zh-CN"/>
         </w:rPr>
       </w:pPr>
-      <w:bookmarkStart w:id="6" w:name="_Toc231914641"/>
+      <w:bookmarkStart w:id="6" w:name="_Toc231916813"/>
       <w:r>
         <w:rPr>
           <w:rFonts w:ascii="Times New Roman" w:eastAsia="黑体" w:hAnsi="Times New Roman"/>
@@ -7194,7 +7393,7 @@
           <w:lang w:eastAsia="zh-CN"/>
         </w:rPr>
       </w:pPr>
-      <w:bookmarkStart w:id="7" w:name="_Toc231914642"/>
+      <w:bookmarkStart w:id="7" w:name="_Toc231916814"/>
       <w:r>
         <w:rPr>
           <w:rFonts w:ascii="Times New Roman" w:eastAsia="黑体" w:hAnsi="Times New Roman"/>
@@ -8140,7 +8339,7 @@
           <w:lang w:eastAsia="zh-CN"/>
         </w:rPr>
       </w:pPr>
-      <w:bookmarkStart w:id="8" w:name="_Toc231914643"/>
+      <w:bookmarkStart w:id="8" w:name="_Toc231916815"/>
       <w:r>
         <w:rPr>
           <w:rFonts w:ascii="Times New Roman" w:eastAsia="黑体" w:hAnsi="Times New Roman"/>
@@ -8679,7 +8878,7 @@
         </w:rPr>
         <w:lastRenderedPageBreak/>
         <w:drawing>
-          <wp:inline distT="0" distB="0" distL="0" distR="0" wp14:anchorId="7ACD4BFF" wp14:editId="30E97730">
+          <wp:inline distT="0" distB="0" distL="0" distR="0" wp14:anchorId="4A8FD227" wp14:editId="0A7DF711">
             <wp:extent cx="5472000" cy="1929130"/>
             <wp:effectExtent l="0" t="0" r="0" b="0"/>
             <wp:docPr id="1" name="Picture 1"/>
@@ -8880,7 +9079,7 @@
         <w:rPr>
           <w:lang w:eastAsia="zh-CN"/>
         </w:rPr>
-        <w:t>：每段主力持有周期的累计收益分布。</w:t>
+        <w:t>每段主力持有周期的累计收益分布。</w:t>
       </w:r>
       <w:r>
         <w:rPr>
@@ -8942,7 +9141,7 @@
           <w:lang w:eastAsia="zh-CN"/>
         </w:rPr>
       </w:pPr>
-      <w:bookmarkStart w:id="9" w:name="_Toc231914644"/>
+      <w:bookmarkStart w:id="9" w:name="_Toc231916816"/>
       <w:r>
         <w:rPr>
           <w:rFonts w:ascii="Times New Roman" w:eastAsia="黑体" w:hAnsi="Times New Roman"/>
@@ -8970,7 +9169,7 @@
           <w:lang w:eastAsia="zh-CN"/>
         </w:rPr>
       </w:pPr>
-      <w:bookmarkStart w:id="10" w:name="_Toc231914645"/>
+      <w:bookmarkStart w:id="10" w:name="_Toc231916817"/>
       <w:r>
         <w:rPr>
           <w:rFonts w:ascii="Times New Roman" w:eastAsia="黑体" w:hAnsi="Times New Roman"/>
@@ -9155,7 +9354,7 @@
           <w:lang w:eastAsia="zh-CN"/>
         </w:rPr>
       </w:pPr>
-      <w:bookmarkStart w:id="11" w:name="_Toc231914646"/>
+      <w:bookmarkStart w:id="11" w:name="_Toc231916818"/>
       <w:r>
         <w:rPr>
           <w:rFonts w:ascii="Times New Roman" w:eastAsia="黑体" w:hAnsi="Times New Roman"/>
@@ -11070,7 +11269,7 @@
           <w:noProof/>
         </w:rPr>
         <w:drawing>
-          <wp:inline distT="0" distB="0" distL="0" distR="0" wp14:anchorId="078E4887" wp14:editId="78811F95">
+          <wp:inline distT="0" distB="0" distL="0" distR="0" wp14:anchorId="1D7BF2F0" wp14:editId="372397A9">
             <wp:extent cx="5472000" cy="1928978"/>
             <wp:effectExtent l="0" t="0" r="0" b="0"/>
             <wp:docPr id="2" name="Picture 2"/>
@@ -11348,7 +11547,7 @@
         </w:rPr>
         <w:lastRenderedPageBreak/>
         <w:drawing>
-          <wp:inline distT="0" distB="0" distL="0" distR="0" wp14:anchorId="0CA58E58" wp14:editId="46527925">
+          <wp:inline distT="0" distB="0" distL="0" distR="0" wp14:anchorId="6B7E0A41" wp14:editId="5D5C53FA">
             <wp:extent cx="5472000" cy="1927278"/>
             <wp:effectExtent l="0" t="0" r="0" b="0"/>
             <wp:docPr id="3" name="Picture 3"/>
@@ -11596,7 +11795,7 @@
           <w:noProof/>
         </w:rPr>
         <w:drawing>
-          <wp:inline distT="0" distB="0" distL="0" distR="0" wp14:anchorId="64FE5C9A" wp14:editId="0D3369D3">
+          <wp:inline distT="0" distB="0" distL="0" distR="0" wp14:anchorId="3A0E7B1B" wp14:editId="58959A1E">
             <wp:extent cx="5472000" cy="1929904"/>
             <wp:effectExtent l="0" t="0" r="0" b="0"/>
             <wp:docPr id="4" name="Picture 4"/>
@@ -11866,7 +12065,7 @@
         </w:rPr>
         <w:lastRenderedPageBreak/>
         <w:drawing>
-          <wp:inline distT="0" distB="0" distL="0" distR="0" wp14:anchorId="086F6A05" wp14:editId="3542F54B">
+          <wp:inline distT="0" distB="0" distL="0" distR="0" wp14:anchorId="7E464C88" wp14:editId="69F3033A">
             <wp:extent cx="5472000" cy="4647581"/>
             <wp:effectExtent l="0" t="0" r="0" b="0"/>
             <wp:docPr id="5" name="Picture 5"/>
@@ -12316,7 +12515,7 @@
           <w:lang w:eastAsia="zh-CN"/>
         </w:rPr>
       </w:pPr>
-      <w:bookmarkStart w:id="12" w:name="_Toc231914647"/>
+      <w:bookmarkStart w:id="12" w:name="_Toc231916819"/>
       <w:r>
         <w:rPr>
           <w:rFonts w:ascii="Times New Roman" w:eastAsia="黑体" w:hAnsi="Times New Roman"/>
@@ -12445,7 +12644,7 @@
           <w:lang w:eastAsia="zh-CN"/>
         </w:rPr>
       </w:pPr>
-      <w:bookmarkStart w:id="13" w:name="_Toc231914648"/>
+      <w:bookmarkStart w:id="13" w:name="_Toc231916820"/>
       <w:r>
         <w:rPr>
           <w:rFonts w:ascii="Times New Roman" w:eastAsia="黑体" w:hAnsi="Times New Roman"/>
@@ -13181,7 +13380,7 @@
           <w:noProof/>
         </w:rPr>
         <w:drawing>
-          <wp:inline distT="0" distB="0" distL="0" distR="0" wp14:anchorId="64C90FEA" wp14:editId="107483C4">
+          <wp:inline distT="0" distB="0" distL="0" distR="0" wp14:anchorId="2ACFB1CC" wp14:editId="7CE49DE5">
             <wp:extent cx="5472000" cy="2085740"/>
             <wp:effectExtent l="0" t="0" r="0" b="0"/>
             <wp:docPr id="6" name="Picture 6"/>
@@ -13521,7 +13720,7 @@
           <w:lang w:eastAsia="zh-CN"/>
         </w:rPr>
       </w:pPr>
-      <w:bookmarkStart w:id="14" w:name="_Toc231914649"/>
+      <w:bookmarkStart w:id="14" w:name="_Toc231916821"/>
       <w:r>
         <w:rPr>
           <w:rFonts w:ascii="Times New Roman" w:eastAsia="黑体" w:hAnsi="Times New Roman"/>
@@ -15681,7 +15880,7 @@
           <w:noProof/>
         </w:rPr>
         <w:drawing>
-          <wp:inline distT="0" distB="0" distL="0" distR="0" wp14:anchorId="60EF9E10" wp14:editId="638FBDED">
+          <wp:inline distT="0" distB="0" distL="0" distR="0" wp14:anchorId="698A62A2" wp14:editId="7CF6D835">
             <wp:extent cx="5472000" cy="1848507"/>
             <wp:effectExtent l="0" t="0" r="0" b="0"/>
             <wp:docPr id="7" name="Picture 7"/>
@@ -16057,7 +16256,7 @@
           <w:lang w:eastAsia="zh-CN"/>
         </w:rPr>
       </w:pPr>
-      <w:bookmarkStart w:id="15" w:name="_Toc231914650"/>
+      <w:bookmarkStart w:id="15" w:name="_Toc231916822"/>
       <w:r>
         <w:rPr>
           <w:rFonts w:ascii="Times New Roman" w:eastAsia="黑体" w:hAnsi="Times New Roman"/>
@@ -17195,7 +17394,7 @@
         </w:rPr>
         <w:lastRenderedPageBreak/>
         <w:drawing>
-          <wp:inline distT="0" distB="0" distL="0" distR="0" wp14:anchorId="1C761F71" wp14:editId="7AA0EC91">
+          <wp:inline distT="0" distB="0" distL="0" distR="0" wp14:anchorId="24D17705" wp14:editId="12CFC7C5">
             <wp:extent cx="5472000" cy="1924653"/>
             <wp:effectExtent l="0" t="0" r="0" b="0"/>
             <wp:docPr id="8" name="Picture 8"/>
@@ -17526,7 +17725,7 @@
           <w:lang w:eastAsia="zh-CN"/>
         </w:rPr>
       </w:pPr>
-      <w:bookmarkStart w:id="16" w:name="_Toc231914651"/>
+      <w:bookmarkStart w:id="16" w:name="_Toc231916823"/>
       <w:r>
         <w:rPr>
           <w:rFonts w:ascii="Times New Roman" w:eastAsia="黑体" w:hAnsi="Times New Roman"/>
@@ -17554,7 +17753,7 @@
           <w:lang w:eastAsia="zh-CN"/>
         </w:rPr>
       </w:pPr>
-      <w:bookmarkStart w:id="17" w:name="_Toc231914652"/>
+      <w:bookmarkStart w:id="17" w:name="_Toc231916824"/>
       <w:r>
         <w:rPr>
           <w:rFonts w:ascii="Times New Roman" w:eastAsia="黑体" w:hAnsi="Times New Roman"/>
@@ -17586,7 +17785,7 @@
         <w:rPr>
           <w:lang w:eastAsia="zh-CN"/>
         </w:rPr>
-        <w:t>课程要求中明确包含跨期套利，因此本报告保留该模块，但对原始方案做了调整。直接使用</w:t>
+        <w:t>跨期套利部分关注的是近月与次近月合约之间的期限结构偏离。直接使用</w:t>
       </w:r>
       <w:r>
         <w:rPr>
@@ -17622,7 +17821,7 @@
         <w:rPr>
           <w:lang w:eastAsia="zh-CN"/>
         </w:rPr>
-        <w:t>点位价差做布林带回归并不够稳妥：一是合约必须按真实到期日排序，不能只按合约代码字符串排序；二是两个合约之间的到期日间隔会变化，</w:t>
+        <w:t>点位价差做布林带回归并不稳妥：一是合约必须按真实到期日排序，不能只按合约代码字符串排序；二是两个合约之间的到期日间隔会变化，</w:t>
       </w:r>
       <w:proofErr w:type="gramStart"/>
       <w:r>
@@ -17913,7 +18112,7 @@
           <w:noProof/>
         </w:rPr>
         <w:drawing>
-          <wp:inline distT="0" distB="0" distL="0" distR="0" wp14:anchorId="0AA07190" wp14:editId="48315098">
+          <wp:inline distT="0" distB="0" distL="0" distR="0" wp14:anchorId="482F98F2" wp14:editId="650B6796">
             <wp:extent cx="5472000" cy="1928978"/>
             <wp:effectExtent l="0" t="0" r="0" b="0"/>
             <wp:docPr id="9" name="Picture 9"/>
@@ -18126,7 +18325,7 @@
         <w:rPr>
           <w:lang w:eastAsia="zh-CN"/>
         </w:rPr>
-        <w:t>的交易边界。红点对应策略处于持仓状态的交易日。可以看到，跨期信号不是连续稳定出现，而是集中在期限结构明显偏离的阶段。</w:t>
+        <w:t>的交易边界。红点对应策略处于持仓状态的交易日。跨期信号不是连续稳定出现，而是集中在期限结构明显偏离的阶段。</w:t>
       </w:r>
       <w:r>
         <w:rPr>
@@ -18161,7 +18360,7 @@
           <w:lang w:eastAsia="zh-CN"/>
         </w:rPr>
       </w:pPr>
-      <w:bookmarkStart w:id="18" w:name="_Toc231914653"/>
+      <w:bookmarkStart w:id="18" w:name="_Toc231916825"/>
       <w:r>
         <w:rPr>
           <w:rFonts w:ascii="Times New Roman" w:eastAsia="黑体" w:hAnsi="Times New Roman"/>
@@ -18195,7 +18394,45 @@
         <w:rPr>
           <w:lang w:eastAsia="zh-CN"/>
         </w:rPr>
-        <w:t>固定规则下，跨期套利的结果明显好于原先的原始价差布林带版本，但仍不能夸大为强套利。该策略属于期货多空组合，净值本身没有计入闲置现金收益，因此下表同时列示</w:t>
+        <w:t>固定规则下，跨期套利</w:t>
+      </w:r>
+      <w:proofErr w:type="gramStart"/>
+      <w:r>
+        <w:rPr>
+          <w:lang w:eastAsia="zh-CN"/>
+        </w:rPr>
+        <w:t>呈现弱正收益</w:t>
+      </w:r>
+      <w:proofErr w:type="gramEnd"/>
+      <w:r>
+        <w:rPr>
+          <w:lang w:eastAsia="zh-CN"/>
+        </w:rPr>
+        <w:t>，但离</w:t>
+      </w:r>
+      <w:r>
+        <w:rPr>
+          <w:lang w:eastAsia="zh-CN"/>
+        </w:rPr>
+        <w:t>“</w:t>
+      </w:r>
+      <w:r>
+        <w:rPr>
+          <w:lang w:eastAsia="zh-CN"/>
+        </w:rPr>
+        <w:t>强套利</w:t>
+      </w:r>
+      <w:r>
+        <w:rPr>
+          <w:lang w:eastAsia="zh-CN"/>
+        </w:rPr>
+        <w:t>”</w:t>
+      </w:r>
+      <w:r>
+        <w:rPr>
+          <w:lang w:eastAsia="zh-CN"/>
+        </w:rPr>
+        <w:t>仍有距离。该策略属于期货多空组合，净值本身没有计入闲置现金收益，因此下表同时列示</w:t>
       </w:r>
       <w:r>
         <w:rPr>
@@ -18231,7 +18468,7 @@
         <w:rPr>
           <w:lang w:eastAsia="zh-CN"/>
         </w:rPr>
-        <w:t>。</w:t>
+        <w:t>。从资金效率角度看，后者更接近实盘评价口径。</w:t>
       </w:r>
     </w:p>
     <w:p>
@@ -19113,7 +19350,7 @@
           <w:noProof/>
         </w:rPr>
         <w:drawing>
-          <wp:inline distT="0" distB="0" distL="0" distR="0" wp14:anchorId="26EDA24C" wp14:editId="0578179A">
+          <wp:inline distT="0" distB="0" distL="0" distR="0" wp14:anchorId="0191C002" wp14:editId="4F7FD063">
             <wp:extent cx="5472000" cy="1929904"/>
             <wp:effectExtent l="0" t="0" r="0" b="0"/>
             <wp:docPr id="10" name="Picture 10"/>
@@ -19414,7 +19651,7 @@
           <w:lang w:eastAsia="zh-CN"/>
         </w:rPr>
       </w:pPr>
-      <w:bookmarkStart w:id="19" w:name="_Toc231914654"/>
+      <w:bookmarkStart w:id="19" w:name="_Toc231916826"/>
       <w:r>
         <w:rPr>
           <w:rFonts w:ascii="Times New Roman" w:eastAsia="黑体" w:hAnsi="Times New Roman"/>
@@ -19446,21 +19683,35 @@
         <w:rPr>
           <w:lang w:eastAsia="zh-CN"/>
         </w:rPr>
-        <w:t>为了检验跨期套利是否可以通过杠杆改善表现，本报告在</w:t>
+        <w:t>杠杆测试用于回答一个更实际的问题：</w:t>
       </w:r>
       <w:proofErr w:type="gramStart"/>
       <w:r>
         <w:rPr>
           <w:lang w:eastAsia="zh-CN"/>
         </w:rPr>
-        <w:t>固定跨</w:t>
+        <w:t>当跨期</w:t>
       </w:r>
       <w:proofErr w:type="gramEnd"/>
       <w:r>
         <w:rPr>
           <w:lang w:eastAsia="zh-CN"/>
         </w:rPr>
-        <w:t>期规则上做</w:t>
+        <w:t>价差本身收益较薄时，放大</w:t>
+      </w:r>
+      <w:proofErr w:type="gramStart"/>
+      <w:r>
+        <w:rPr>
+          <w:lang w:eastAsia="zh-CN"/>
+        </w:rPr>
+        <w:t>仓位</w:t>
+      </w:r>
+      <w:proofErr w:type="gramEnd"/>
+      <w:r>
+        <w:rPr>
+          <w:lang w:eastAsia="zh-CN"/>
+        </w:rPr>
+        <w:t>能否改善策略可用性。这里没有重新挑选参数，只是把同一条净收益序列按</w:t>
       </w:r>
       <w:r>
         <w:rPr>
@@ -19508,7 +19759,7 @@
         <w:rPr>
           <w:lang w:eastAsia="zh-CN"/>
         </w:rPr>
-        <w:t>压力测试。这里没有重新挑选参数，只是把同一条净收益序列按倍数放大；交易成本和保证金占用也同步放大。保证金按双腿名义本金的</w:t>
+        <w:t>放大；交易成本和保证金占用也同步放大。保证金按双腿名义本金的</w:t>
       </w:r>
       <w:r>
         <w:rPr>
@@ -21633,7 +21884,7 @@
           <w:noProof/>
         </w:rPr>
         <w:drawing>
-          <wp:inline distT="0" distB="0" distL="0" distR="0" wp14:anchorId="6B2E2830" wp14:editId="64C8B0F2">
+          <wp:inline distT="0" distB="0" distL="0" distR="0" wp14:anchorId="756A40A0" wp14:editId="083E3D8E">
             <wp:extent cx="5472000" cy="1929904"/>
             <wp:effectExtent l="0" t="0" r="0" b="0"/>
             <wp:docPr id="11" name="Picture 11"/>
@@ -22061,7 +22312,7 @@
           <w:lang w:eastAsia="zh-CN"/>
         </w:rPr>
       </w:pPr>
-      <w:bookmarkStart w:id="20" w:name="_Toc231914655"/>
+      <w:bookmarkStart w:id="20" w:name="_Toc231916827"/>
       <w:r>
         <w:rPr>
           <w:rFonts w:ascii="Times New Roman" w:eastAsia="黑体" w:hAnsi="Times New Roman"/>
@@ -22208,7 +22459,7 @@
           <w:lang w:eastAsia="zh-CN"/>
         </w:rPr>
       </w:pPr>
-      <w:bookmarkStart w:id="21" w:name="_Toc231914656"/>
+      <w:bookmarkStart w:id="21" w:name="_Toc231916828"/>
       <w:r>
         <w:rPr>
           <w:rFonts w:ascii="Times New Roman" w:eastAsia="黑体" w:hAnsi="Times New Roman"/>
@@ -22241,7 +22492,7 @@
         <w:rPr>
           <w:lang w:eastAsia="zh-CN"/>
         </w:rPr>
-        <w:t>本报告原计划构建</w:t>
+        <w:t>组合层面的初衷是将</w:t>
       </w:r>
       <w:r>
         <w:rPr>
@@ -22259,7 +22510,19 @@
         <w:rPr>
           <w:lang w:eastAsia="zh-CN"/>
         </w:rPr>
-        <w:t xml:space="preserve"> + </w:t>
+        <w:t>”</w:t>
+      </w:r>
+      <w:r>
+        <w:rPr>
+          <w:lang w:eastAsia="zh-CN"/>
+        </w:rPr>
+        <w:t>和</w:t>
+      </w:r>
+      <w:r>
+        <w:rPr>
+          <w:lang w:eastAsia="zh-CN"/>
+        </w:rPr>
+        <w:t>“</w:t>
       </w:r>
       <w:r>
         <w:rPr>
@@ -22277,7 +22540,7 @@
         <w:rPr>
           <w:lang w:eastAsia="zh-CN"/>
         </w:rPr>
-        <w:t>的双策略组合：以吃贴水获取方向性收益与展期补偿，以跨期套利提供更接近市场中性的第二收益来源。第</w:t>
+        <w:t>分开：前者获取方向性收益与展期补偿，后者尝试提供更接近市场中性的第二收益来源。第</w:t>
       </w:r>
       <w:r>
         <w:rPr>
@@ -22289,7 +22552,7 @@
         <w:rPr>
           <w:lang w:eastAsia="zh-CN"/>
         </w:rPr>
-        <w:t>章优化后，跨期策略在</w:t>
+        <w:t>章显示，跨期策略在</w:t>
       </w:r>
       <w:r>
         <w:rPr>
@@ -22301,21 +22564,21 @@
         <w:rPr>
           <w:lang w:eastAsia="zh-CN"/>
         </w:rPr>
-        <w:t>上取得了</w:t>
+        <w:t>上</w:t>
       </w:r>
       <w:proofErr w:type="gramStart"/>
       <w:r>
         <w:rPr>
           <w:lang w:eastAsia="zh-CN"/>
         </w:rPr>
-        <w:t>较弱正</w:t>
+        <w:t>有弱正收益</w:t>
       </w:r>
       <w:proofErr w:type="gramEnd"/>
       <w:r>
         <w:rPr>
           <w:lang w:eastAsia="zh-CN"/>
         </w:rPr>
-        <w:t>收益，</w:t>
+        <w:t>，</w:t>
       </w:r>
       <w:r>
         <w:rPr>
@@ -22327,7 +22590,7 @@
         <w:rPr>
           <w:lang w:eastAsia="zh-CN"/>
         </w:rPr>
-        <w:t>基本接近打平，说明该模块并非完全没有研究价值；但其收益厚度、样本长度和执行敏感性仍不足以承担主策略角色。</w:t>
+        <w:t>基本接近打平，说明期限结构斜率并非完全没有信息含量；但收益厚度、样本长度和执行敏感性仍不足以支撑较高组合权重。</w:t>
       </w:r>
     </w:p>
     <w:p>
@@ -22343,7 +22606,7 @@
         <w:rPr>
           <w:lang w:eastAsia="zh-CN"/>
         </w:rPr>
-        <w:t>因此，本章组合分析采用更稳妥的处理方式：</w:t>
+        <w:t>因此，本章采用更稳妥的组合口径：</w:t>
       </w:r>
       <w:r>
         <w:rPr>
@@ -22430,7 +22693,7 @@
         <w:rPr>
           <w:lang w:eastAsia="zh-CN"/>
         </w:rPr>
-        <w:t>赋予较高权重，容易把本就不厚的价差收益暴露在成本和执行误差之下。组合层面的重点仍应先回答一个更基础的问题：</w:t>
+        <w:t>赋予较高权重，容易把本就不厚的价差收益暴露在成本和执行误差之下。组合层面的首要问题仍是：</w:t>
       </w:r>
       <w:r>
         <w:rPr>
@@ -22465,7 +22728,7 @@
           <w:lang w:eastAsia="zh-CN"/>
         </w:rPr>
       </w:pPr>
-      <w:bookmarkStart w:id="22" w:name="_Toc231914657"/>
+      <w:bookmarkStart w:id="22" w:name="_Toc231916829"/>
       <w:r>
         <w:rPr>
           <w:rFonts w:ascii="Times New Roman" w:eastAsia="黑体" w:hAnsi="Times New Roman"/>
@@ -22645,7 +22908,7 @@
         <w:pStyle w:val="21"/>
         <w:spacing w:after="120"/>
       </w:pPr>
-      <w:bookmarkStart w:id="23" w:name="_Toc231914658"/>
+      <w:bookmarkStart w:id="23" w:name="_Toc231916830"/>
       <w:r>
         <w:rPr>
           <w:rFonts w:ascii="Times New Roman" w:eastAsia="黑体" w:hAnsi="Times New Roman"/>
@@ -22940,7 +23203,7 @@
         </w:rPr>
         <w:lastRenderedPageBreak/>
         <w:drawing>
-          <wp:inline distT="0" distB="0" distL="0" distR="0" wp14:anchorId="02392955" wp14:editId="65F34731">
+          <wp:inline distT="0" distB="0" distL="0" distR="0" wp14:anchorId="56CC14C6" wp14:editId="6E45E5DD">
             <wp:extent cx="5472000" cy="5466703"/>
             <wp:effectExtent l="0" t="0" r="0" b="0"/>
             <wp:docPr id="12" name="Picture 12"/>
@@ -23286,7 +23549,7 @@
           <w:lang w:eastAsia="zh-CN"/>
         </w:rPr>
       </w:pPr>
-      <w:bookmarkStart w:id="24" w:name="_Toc231914659"/>
+      <w:bookmarkStart w:id="24" w:name="_Toc231916831"/>
       <w:r>
         <w:rPr>
           <w:rFonts w:ascii="Times New Roman" w:eastAsia="黑体" w:hAnsi="Times New Roman"/>
@@ -23543,9 +23806,6 @@
         <w:spacing w:after="120" w:line="400" w:lineRule="exact"/>
         <w:ind w:firstLine="420"/>
         <w:jc w:val="both"/>
-        <w:rPr>
-          <w:lang w:eastAsia="zh-CN"/>
-        </w:rPr>
       </w:pPr>
       <w:r>
         <w:rPr>
@@ -23698,28 +23958,23 @@
         <w:t>。</w:t>
       </w:r>
       <w:r>
-        <w:rPr>
-          <w:lang w:eastAsia="zh-CN"/>
-        </w:rPr>
         <w:t xml:space="preserve">IC-only </w:t>
       </w:r>
-      <w:r>
-        <w:rPr>
-          <w:lang w:eastAsia="zh-CN"/>
-        </w:rPr>
+      <w:proofErr w:type="spellStart"/>
+      <w:r>
         <w:t>的推论置信度远高于任何涉及</w:t>
       </w:r>
-      <w:r>
-        <w:rPr>
-          <w:lang w:eastAsia="zh-CN"/>
-        </w:rPr>
+      <w:proofErr w:type="spellEnd"/>
+      <w:r>
         <w:t xml:space="preserve"> IM </w:t>
       </w:r>
-      <w:r>
-        <w:rPr>
-          <w:lang w:eastAsia="zh-CN"/>
-        </w:rPr>
-        <w:t>的组合。</w:t>
+      <w:proofErr w:type="spellStart"/>
+      <w:r>
+        <w:t>的组合</w:t>
+      </w:r>
+      <w:proofErr w:type="spellEnd"/>
+      <w:r>
+        <w:t>。</w:t>
       </w:r>
     </w:p>
     <w:p>
@@ -23730,7 +23985,7 @@
           <w:lang w:eastAsia="zh-CN"/>
         </w:rPr>
       </w:pPr>
-      <w:bookmarkStart w:id="25" w:name="_Toc231914660"/>
+      <w:bookmarkStart w:id="25" w:name="_Toc231916832"/>
       <w:r>
         <w:rPr>
           <w:rFonts w:ascii="Times New Roman" w:eastAsia="黑体" w:hAnsi="Times New Roman"/>
@@ -23991,7 +24246,7 @@
           <w:bottom w:val="single" w:sz="8" w:space="1" w:color="808080"/>
         </w:pBdr>
       </w:pPr>
-      <w:bookmarkStart w:id="26" w:name="_Toc231914661"/>
+      <w:bookmarkStart w:id="26" w:name="_Toc231916833"/>
       <w:r>
         <w:rPr>
           <w:rFonts w:ascii="Times New Roman" w:eastAsia="黑体" w:hAnsi="Times New Roman"/>
@@ -24016,7 +24271,7 @@
         <w:pStyle w:val="21"/>
         <w:spacing w:after="120"/>
       </w:pPr>
-      <w:bookmarkStart w:id="27" w:name="_Toc231914662"/>
+      <w:bookmarkStart w:id="27" w:name="_Toc231916834"/>
       <w:r>
         <w:rPr>
           <w:rFonts w:ascii="Times New Roman" w:eastAsia="黑体" w:hAnsi="Times New Roman"/>
@@ -24750,7 +25005,7 @@
           <w:noProof/>
         </w:rPr>
         <w:drawing>
-          <wp:inline distT="0" distB="0" distL="0" distR="0" wp14:anchorId="40FF0E2D" wp14:editId="13CFA9FE">
+          <wp:inline distT="0" distB="0" distL="0" distR="0" wp14:anchorId="0A904BBF" wp14:editId="5CB6869F">
             <wp:extent cx="5472000" cy="1929904"/>
             <wp:effectExtent l="0" t="0" r="0" b="0"/>
             <wp:docPr id="13" name="Picture 13"/>
@@ -25080,7 +25335,7 @@
           <w:lang w:eastAsia="zh-CN"/>
         </w:rPr>
       </w:pPr>
-      <w:bookmarkStart w:id="28" w:name="_Toc231914663"/>
+      <w:bookmarkStart w:id="28" w:name="_Toc231916835"/>
       <w:r>
         <w:rPr>
           <w:rFonts w:ascii="Times New Roman" w:eastAsia="黑体" w:hAnsi="Times New Roman"/>
@@ -25104,23 +25359,16 @@
         <w:spacing w:after="120" w:line="400" w:lineRule="exact"/>
         <w:ind w:firstLine="420"/>
         <w:jc w:val="both"/>
-        <w:rPr>
-          <w:lang w:eastAsia="zh-CN"/>
-        </w:rPr>
       </w:pPr>
-      <w:r>
-        <w:rPr>
-          <w:lang w:eastAsia="zh-CN"/>
-        </w:rPr>
+      <w:proofErr w:type="spellStart"/>
+      <w:r>
         <w:t>采用无截距回归：</w:t>
       </w:r>
-      <w:proofErr w:type="spellStart"/>
       <w:r>
         <w:rPr>
           <w:rFonts w:ascii="Consolas" w:hAnsi="Consolas"/>
           <w:color w:val="555555"/>
           <w:sz w:val="23"/>
-          <w:lang w:eastAsia="zh-CN"/>
         </w:rPr>
         <w:t>r_strategy</w:t>
       </w:r>
@@ -25130,26 +25378,26 @@
           <w:rFonts w:ascii="Consolas" w:hAnsi="Consolas"/>
           <w:color w:val="555555"/>
           <w:sz w:val="23"/>
-          <w:lang w:eastAsia="zh-CN"/>
-        </w:rPr>
-        <w:t xml:space="preserve"> = </w:t>
-      </w:r>
+        </w:rPr>
+        <w:t xml:space="preserve"> = β × </w:t>
+      </w:r>
+      <w:proofErr w:type="spellStart"/>
       <w:r>
         <w:rPr>
           <w:rFonts w:ascii="Consolas" w:hAnsi="Consolas"/>
           <w:color w:val="555555"/>
           <w:sz w:val="23"/>
         </w:rPr>
-        <w:t>β</w:t>
-      </w:r>
+        <w:t>r_index</w:t>
+      </w:r>
+      <w:proofErr w:type="spellEnd"/>
       <w:r>
         <w:rPr>
           <w:rFonts w:ascii="Consolas" w:hAnsi="Consolas"/>
           <w:color w:val="555555"/>
           <w:sz w:val="23"/>
-          <w:lang w:eastAsia="zh-CN"/>
-        </w:rPr>
-        <w:t xml:space="preserve"> × </w:t>
+        </w:rPr>
+        <w:t xml:space="preserve"> + </w:t>
       </w:r>
       <w:proofErr w:type="spellStart"/>
       <w:r>
@@ -25157,45 +25405,23 @@
           <w:rFonts w:ascii="Consolas" w:hAnsi="Consolas"/>
           <w:color w:val="555555"/>
           <w:sz w:val="23"/>
-          <w:lang w:eastAsia="zh-CN"/>
-        </w:rPr>
-        <w:t>r_index</w:t>
+        </w:rPr>
+        <w:t>ε</w:t>
+      </w:r>
+      <w:r>
+        <w:t>。残差年均值衡量扣除指数</w:t>
       </w:r>
       <w:proofErr w:type="spellEnd"/>
       <w:r>
-        <w:rPr>
-          <w:rFonts w:ascii="Consolas" w:hAnsi="Consolas"/>
-          <w:color w:val="555555"/>
-          <w:sz w:val="23"/>
-          <w:lang w:eastAsia="zh-CN"/>
-        </w:rPr>
-        <w:t xml:space="preserve"> + </w:t>
-      </w:r>
-      <w:r>
-        <w:rPr>
-          <w:rFonts w:ascii="Consolas" w:hAnsi="Consolas"/>
-          <w:color w:val="555555"/>
-          <w:sz w:val="23"/>
-        </w:rPr>
-        <w:t>ε</w:t>
-      </w:r>
-      <w:r>
-        <w:rPr>
-          <w:lang w:eastAsia="zh-CN"/>
-        </w:rPr>
-        <w:t>。残差年均值衡量扣除指数</w:t>
-      </w:r>
-      <w:r>
-        <w:rPr>
-          <w:lang w:eastAsia="zh-CN"/>
-        </w:rPr>
         <w:t xml:space="preserve"> beta </w:t>
       </w:r>
-      <w:r>
-        <w:rPr>
-          <w:lang w:eastAsia="zh-CN"/>
-        </w:rPr>
-        <w:t>后的超额。</w:t>
+      <w:proofErr w:type="spellStart"/>
+      <w:r>
+        <w:t>后的超额</w:t>
+      </w:r>
+      <w:proofErr w:type="spellEnd"/>
+      <w:r>
+        <w:t>。</w:t>
       </w:r>
     </w:p>
     <w:p>
@@ -26307,7 +26533,7 @@
         </w:rPr>
         <w:lastRenderedPageBreak/>
         <w:drawing>
-          <wp:inline distT="0" distB="0" distL="0" distR="0" wp14:anchorId="20B9405B" wp14:editId="7DE696AE">
+          <wp:inline distT="0" distB="0" distL="0" distR="0" wp14:anchorId="6157705B" wp14:editId="727E30CB">
             <wp:extent cx="5472000" cy="3248539"/>
             <wp:effectExtent l="0" t="0" r="0" b="0"/>
             <wp:docPr id="14" name="Picture 14"/>
@@ -26635,7 +26861,7 @@
         <w:pStyle w:val="21"/>
         <w:spacing w:after="120"/>
       </w:pPr>
-      <w:bookmarkStart w:id="29" w:name="_Toc231914664"/>
+      <w:bookmarkStart w:id="29" w:name="_Toc231916836"/>
       <w:r>
         <w:rPr>
           <w:rFonts w:ascii="Times New Roman" w:eastAsia="黑体" w:hAnsi="Times New Roman"/>
@@ -26743,12 +26969,16 @@
         <w:keepNext/>
         <w:spacing w:before="80" w:after="80" w:line="240" w:lineRule="auto"/>
         <w:jc w:val="center"/>
+        <w:rPr>
+          <w:lang w:eastAsia="zh-CN"/>
+        </w:rPr>
       </w:pPr>
       <w:r>
         <w:rPr>
           <w:b/>
           <w:color w:val="555555"/>
           <w:sz w:val="21"/>
+          <w:lang w:eastAsia="zh-CN"/>
         </w:rPr>
         <w:t>表</w:t>
       </w:r>
@@ -26757,124 +26987,98 @@
           <w:b/>
           <w:color w:val="555555"/>
           <w:sz w:val="21"/>
+          <w:lang w:eastAsia="zh-CN"/>
         </w:rPr>
         <w:t xml:space="preserve"> 14 </w:t>
       </w:r>
-      <w:proofErr w:type="spellStart"/>
       <w:r>
         <w:rPr>
           <w:b/>
           <w:color w:val="555555"/>
           <w:sz w:val="21"/>
+          <w:lang w:eastAsia="zh-CN"/>
         </w:rPr>
         <w:t>有截距</w:t>
       </w:r>
-      <w:proofErr w:type="spellEnd"/>
       <w:r>
         <w:rPr>
           <w:b/>
           <w:color w:val="555555"/>
           <w:sz w:val="21"/>
+          <w:lang w:eastAsia="zh-CN"/>
         </w:rPr>
         <w:t xml:space="preserve"> CAPM </w:t>
       </w:r>
-      <w:proofErr w:type="spellStart"/>
       <w:r>
         <w:rPr>
           <w:b/>
           <w:color w:val="555555"/>
           <w:sz w:val="21"/>
-        </w:rPr>
-        <w:t>归因（日频</w:t>
-      </w:r>
-      <w:proofErr w:type="spellEnd"/>
+          <w:lang w:eastAsia="zh-CN"/>
+        </w:rPr>
+        <w:t>归因（日频）：加入截距项后的日频</w:t>
+      </w:r>
       <w:r>
         <w:rPr>
           <w:b/>
           <w:color w:val="555555"/>
           <w:sz w:val="21"/>
-        </w:rPr>
-        <w:t>）：</w:t>
-      </w:r>
-      <w:proofErr w:type="spellStart"/>
+          <w:lang w:eastAsia="zh-CN"/>
+        </w:rPr>
+        <w:t xml:space="preserve"> CAPM </w:t>
+      </w:r>
       <w:r>
         <w:rPr>
           <w:b/>
           <w:color w:val="555555"/>
           <w:sz w:val="21"/>
-        </w:rPr>
-        <w:t>加入截距项后的日频</w:t>
-      </w:r>
-      <w:proofErr w:type="spellEnd"/>
+          <w:lang w:eastAsia="zh-CN"/>
+        </w:rPr>
+        <w:t>归因，</w:t>
+      </w:r>
       <w:r>
         <w:rPr>
           <w:b/>
           <w:color w:val="555555"/>
           <w:sz w:val="21"/>
         </w:rPr>
-        <w:t xml:space="preserve"> CAPM </w:t>
-      </w:r>
-      <w:proofErr w:type="spellStart"/>
+        <w:t>α</w:t>
+      </w:r>
       <w:r>
         <w:rPr>
           <w:b/>
           <w:color w:val="555555"/>
           <w:sz w:val="21"/>
-        </w:rPr>
-        <w:t>归因</w:t>
-      </w:r>
-      <w:proofErr w:type="spellEnd"/>
+          <w:lang w:eastAsia="zh-CN"/>
+        </w:rPr>
+        <w:t xml:space="preserve"> </w:t>
+      </w:r>
       <w:r>
         <w:rPr>
           <w:b/>
           <w:color w:val="555555"/>
           <w:sz w:val="21"/>
-        </w:rPr>
-        <w:t>，</w:t>
+          <w:lang w:eastAsia="zh-CN"/>
+        </w:rPr>
+        <w:t>衡量扣除指数</w:t>
       </w:r>
       <w:r>
         <w:rPr>
           <w:b/>
           <w:color w:val="555555"/>
           <w:sz w:val="21"/>
-        </w:rPr>
-        <w:t xml:space="preserve">α </w:t>
-      </w:r>
-      <w:proofErr w:type="spellStart"/>
+          <w:lang w:eastAsia="zh-CN"/>
+        </w:rPr>
+        <w:t xml:space="preserve"> beta </w:t>
+      </w:r>
       <w:r>
         <w:rPr>
           <w:b/>
           <w:color w:val="555555"/>
           <w:sz w:val="21"/>
-        </w:rPr>
-        <w:t>衡量扣除指数</w:t>
-      </w:r>
-      <w:proofErr w:type="spellEnd"/>
-      <w:r>
-        <w:rPr>
-          <w:b/>
-          <w:color w:val="555555"/>
-          <w:sz w:val="21"/>
-        </w:rPr>
-        <w:t xml:space="preserve"> beta </w:t>
-      </w:r>
-      <w:proofErr w:type="spellStart"/>
-      <w:r>
-        <w:rPr>
-          <w:b/>
-          <w:color w:val="555555"/>
-          <w:sz w:val="21"/>
-        </w:rPr>
-        <w:t>后的平均日超额</w:t>
-      </w:r>
-      <w:proofErr w:type="spellEnd"/>
-      <w:r>
-        <w:rPr>
-          <w:b/>
-          <w:color w:val="555555"/>
-          <w:sz w:val="21"/>
-        </w:rPr>
-        <w:t>。</w:t>
+          <w:lang w:eastAsia="zh-CN"/>
+        </w:rPr>
+        <w:t>后的平均日超额。</w:t>
       </w:r>
     </w:p>
     <w:tbl>
@@ -27915,9 +28119,6 @@
         <w:spacing w:after="120" w:line="400" w:lineRule="exact"/>
         <w:ind w:firstLine="420"/>
         <w:jc w:val="both"/>
-        <w:rPr>
-          <w:lang w:eastAsia="zh-CN"/>
-        </w:rPr>
       </w:pPr>
       <w:proofErr w:type="spellStart"/>
       <w:r>
@@ -27977,17 +28178,11 @@
       </w:r>
       <w:proofErr w:type="spellStart"/>
       <w:r>
-        <w:t>偏低同样源于日频噪声</w:t>
+        <w:t>偏低同样源于日频噪声。改为月频回归</w:t>
       </w:r>
       <w:proofErr w:type="spellEnd"/>
       <w:r>
-        <w:t>。</w:t>
-      </w:r>
-      <w:r>
-        <w:rPr>
-          <w:lang w:eastAsia="zh-CN"/>
-        </w:rPr>
-        <w:t>改为月频回归：</w:t>
+        <w:t>：</w:t>
       </w:r>
     </w:p>
     <w:p>
@@ -28675,7 +28870,7 @@
           <w:noProof/>
         </w:rPr>
         <w:drawing>
-          <wp:inline distT="0" distB="0" distL="0" distR="0" wp14:anchorId="122F9730" wp14:editId="46C7B739">
+          <wp:inline distT="0" distB="0" distL="0" distR="0" wp14:anchorId="6E22BE80" wp14:editId="45F31DED">
             <wp:extent cx="5472000" cy="2971989"/>
             <wp:effectExtent l="0" t="0" r="0" b="0"/>
             <wp:docPr id="15" name="Picture 15"/>
@@ -29220,7 +29415,7 @@
           <w:lang w:eastAsia="zh-CN"/>
         </w:rPr>
       </w:pPr>
-      <w:bookmarkStart w:id="30" w:name="_Toc231914665"/>
+      <w:bookmarkStart w:id="30" w:name="_Toc231916837"/>
       <w:r>
         <w:rPr>
           <w:rFonts w:ascii="Times New Roman" w:eastAsia="黑体" w:hAnsi="Times New Roman"/>
@@ -29248,7 +29443,7 @@
           <w:lang w:eastAsia="zh-CN"/>
         </w:rPr>
       </w:pPr>
-      <w:bookmarkStart w:id="31" w:name="_Toc231914666"/>
+      <w:bookmarkStart w:id="31" w:name="_Toc231916838"/>
       <w:r>
         <w:rPr>
           <w:rFonts w:ascii="Times New Roman" w:eastAsia="黑体" w:hAnsi="Times New Roman"/>
@@ -29279,7 +29474,7 @@
           <w:noProof/>
         </w:rPr>
         <w:drawing>
-          <wp:inline distT="0" distB="0" distL="0" distR="0" wp14:anchorId="76CCD4AE" wp14:editId="2B080249">
+          <wp:inline distT="0" distB="0" distL="0" distR="0" wp14:anchorId="1ACFD674" wp14:editId="3262F350">
             <wp:extent cx="5472000" cy="2702814"/>
             <wp:effectExtent l="0" t="0" r="0" b="0"/>
             <wp:docPr id="16" name="Picture 16"/>
@@ -29588,7 +29783,7 @@
           <w:lang w:eastAsia="zh-CN"/>
         </w:rPr>
       </w:pPr>
-      <w:bookmarkStart w:id="32" w:name="_Toc231914667"/>
+      <w:bookmarkStart w:id="32" w:name="_Toc231916839"/>
       <w:r>
         <w:rPr>
           <w:rFonts w:ascii="Times New Roman" w:eastAsia="黑体" w:hAnsi="Times New Roman"/>
@@ -29939,7 +30134,7 @@
           <w:lang w:eastAsia="zh-CN"/>
         </w:rPr>
       </w:pPr>
-      <w:bookmarkStart w:id="33" w:name="_Toc231914668"/>
+      <w:bookmarkStart w:id="33" w:name="_Toc231916840"/>
       <w:r>
         <w:rPr>
           <w:rFonts w:ascii="Times New Roman" w:eastAsia="黑体" w:hAnsi="Times New Roman"/>
@@ -30481,7 +30676,7 @@
           <w:lang w:eastAsia="zh-CN"/>
         </w:rPr>
       </w:pPr>
-      <w:bookmarkStart w:id="34" w:name="_Toc231914669"/>
+      <w:bookmarkStart w:id="34" w:name="_Toc231916841"/>
       <w:r>
         <w:rPr>
           <w:rFonts w:ascii="Times New Roman" w:eastAsia="黑体" w:hAnsi="Times New Roman"/>
@@ -31352,7 +31547,7 @@
           <w:lang w:eastAsia="zh-CN"/>
         </w:rPr>
       </w:pPr>
-      <w:bookmarkStart w:id="35" w:name="_Toc231914670"/>
+      <w:bookmarkStart w:id="35" w:name="_Toc231916842"/>
       <w:r>
         <w:rPr>
           <w:rFonts w:ascii="Times New Roman" w:eastAsia="黑体" w:hAnsi="Times New Roman"/>
@@ -33218,31 +33413,31 @@
       </w:rPr>
     </w:lvl>
   </w:abstractNum>
-  <w:num w:numId="1" w16cid:durableId="953361767">
+  <w:num w:numId="1" w16cid:durableId="121197425">
     <w:abstractNumId w:val="8"/>
   </w:num>
-  <w:num w:numId="2" w16cid:durableId="405685936">
+  <w:num w:numId="2" w16cid:durableId="913977878">
     <w:abstractNumId w:val="6"/>
   </w:num>
-  <w:num w:numId="3" w16cid:durableId="1268465604">
+  <w:num w:numId="3" w16cid:durableId="1347749145">
     <w:abstractNumId w:val="5"/>
   </w:num>
-  <w:num w:numId="4" w16cid:durableId="1421215752">
+  <w:num w:numId="4" w16cid:durableId="1333949218">
     <w:abstractNumId w:val="4"/>
   </w:num>
-  <w:num w:numId="5" w16cid:durableId="438306400">
+  <w:num w:numId="5" w16cid:durableId="1799493862">
     <w:abstractNumId w:val="7"/>
   </w:num>
-  <w:num w:numId="6" w16cid:durableId="1270042226">
+  <w:num w:numId="6" w16cid:durableId="1094128182">
     <w:abstractNumId w:val="3"/>
   </w:num>
-  <w:num w:numId="7" w16cid:durableId="316959073">
+  <w:num w:numId="7" w16cid:durableId="673846452">
     <w:abstractNumId w:val="2"/>
   </w:num>
-  <w:num w:numId="8" w16cid:durableId="1312445367">
+  <w:num w:numId="8" w16cid:durableId="1175726491">
     <w:abstractNumId w:val="1"/>
   </w:num>
-  <w:num w:numId="9" w16cid:durableId="1637182152">
+  <w:num w:numId="9" w16cid:durableId="1797216770">
     <w:abstractNumId w:val="0"/>
   </w:num>
 </w:numbering>
@@ -44640,7 +44835,7 @@
     <w:autoRedefine/>
     <w:uiPriority w:val="39"/>
     <w:unhideWhenUsed/>
-    <w:rsid w:val="001C02AB"/>
+    <w:rsid w:val="000D5635"/>
   </w:style>
   <w:style w:type="paragraph" w:styleId="TOC2">
     <w:name w:val="toc 2"/>
@@ -44649,7 +44844,7 @@
     <w:autoRedefine/>
     <w:uiPriority w:val="39"/>
     <w:unhideWhenUsed/>
-    <w:rsid w:val="001C02AB"/>
+    <w:rsid w:val="000D5635"/>
     <w:pPr>
       <w:ind w:leftChars="200" w:left="420"/>
     </w:pPr>
@@ -44659,7 +44854,7 @@
     <w:basedOn w:val="a2"/>
     <w:uiPriority w:val="99"/>
     <w:unhideWhenUsed/>
-    <w:rsid w:val="001C02AB"/>
+    <w:rsid w:val="000D5635"/>
     <w:rPr>
       <w:color w:val="0000FF" w:themeColor="hyperlink"/>
       <w:u w:val="single"/>

</xml_diff>